<commit_message>
docs: SDD v3.2 源-平台-目标架构并加入 AIEngine
- 重绘逻辑架构图：源库→迁移平台→目标库/消息队列
- 重绘三层模块图：接入/编排/组件，Supervisor 统一监控，含 AIEngine
- 删除单机/多节点部署章节与相关图
- 新增 AIEngine 模块（映射建议、异常诊断、差异解释）
- 更新 README、总体设计概述与 Word 交付版

Co-authored-by: program231 <program231@users.noreply.github.com>
</commit_message>
<xml_diff>
--- a/doc/迁移平台软件设计说明书.docx
+++ b/doc/迁移平台软件设计说明书.docx
@@ -2,7 +2,7 @@
 <file path=word/document.xml><?xml version="1.0" encoding="utf-8"?>
 <w:document xmlns:w="http://schemas.openxmlformats.org/wordprocessingml/2006/main" xmlns:m="http://schemas.openxmlformats.org/officeDocument/2006/math" xmlns:r="http://schemas.openxmlformats.org/officeDocument/2006/relationships" xmlns:o="urn:schemas-microsoft-com:office:office" xmlns:v="urn:schemas-microsoft-com:vml" xmlns:w10="urn:schemas-microsoft-com:office:word" xmlns:a="http://schemas.openxmlformats.org/drawingml/2006/main" xmlns:pic="http://schemas.openxmlformats.org/drawingml/2006/picture" xmlns:wp="http://schemas.openxmlformats.org/drawingml/2006/wordprocessingDrawing">
   <w:body>
-    <w:bookmarkStart w:id="130" w:name="迁移平台软件设计说明书"/>
+    <w:bookmarkStart w:id="122" w:name="迁移平台软件设计说明书"/>
     <w:p>
       <w:pPr>
         <w:pStyle w:val="Heading1"/>
@@ -106,7 +106,7 @@
               <w:jc w:val="left"/>
             </w:pPr>
             <w:r>
-              <w:t xml:space="preserve">v3.1</w:t>
+              <w:t xml:space="preserve">v3.2</w:t>
             </w:r>
           </w:p>
         </w:tc>
@@ -342,7 +342,7 @@
               <w:jc w:val="left"/>
             </w:pPr>
             <w:r>
-              <w:t xml:space="preserve">初稿：基于总体设计编制 SDD，完成架构、模块、流程与非功能设计</w:t>
+              <w:t xml:space="preserve">初稿：完成架构、模块、流程与非功能设计</w:t>
             </w:r>
           </w:p>
         </w:tc>
@@ -404,7 +404,7 @@
               <w:jc w:val="left"/>
             </w:pPr>
             <w:r>
-              <w:t xml:space="preserve">修订：完善模块划分、流程衔接与部署视图</w:t>
+              <w:t xml:space="preserve">修订：完善模块划分与流程衔接</w:t>
             </w:r>
           </w:p>
         </w:tc>
@@ -466,7 +466,7 @@
               <w:jc w:val="left"/>
             </w:pPr>
             <w:r>
-              <w:t xml:space="preserve">模块图改为分层嵌套风格；精简模块介绍；规范架构与流程写法</w:t>
+              <w:t xml:space="preserve">模块图改为分层嵌套风格；精简模块介绍</w:t>
             </w:r>
           </w:p>
         </w:tc>
@@ -528,7 +528,69 @@
               <w:jc w:val="left"/>
             </w:pPr>
             <w:r>
-              <w:t xml:space="preserve">优化流程/模块图可读性；完善交付文档索引与概述</w:t>
+              <w:t xml:space="preserve">优化流程/模块图可读性</w:t>
+            </w:r>
+          </w:p>
+        </w:tc>
+        <w:tc>
+          <w:tcPr/>
+          <w:p>
+            <w:pPr>
+              <w:pStyle w:val="Compact"/>
+              <w:jc w:val="left"/>
+            </w:pPr>
+            <w:r>
+              <w:t xml:space="preserve">已归档</w:t>
+            </w:r>
+          </w:p>
+        </w:tc>
+      </w:tr>
+      <w:tr>
+        <w:tc>
+          <w:tcPr/>
+          <w:p>
+            <w:pPr>
+              <w:pStyle w:val="Compact"/>
+              <w:jc w:val="left"/>
+            </w:pPr>
+            <w:r>
+              <w:t xml:space="preserve">v3.2</w:t>
+            </w:r>
+          </w:p>
+        </w:tc>
+        <w:tc>
+          <w:tcPr/>
+          <w:p>
+            <w:pPr>
+              <w:pStyle w:val="Compact"/>
+              <w:jc w:val="left"/>
+            </w:pPr>
+            <w:r>
+              <w:t xml:space="preserve">2026-07-10</w:t>
+            </w:r>
+          </w:p>
+        </w:tc>
+        <w:tc>
+          <w:tcPr/>
+          <w:p>
+            <w:pPr>
+              <w:pStyle w:val="Compact"/>
+              <w:jc w:val="left"/>
+            </w:pPr>
+            <w:r>
+              <w:t xml:space="preserve">—</w:t>
+            </w:r>
+          </w:p>
+        </w:tc>
+        <w:tc>
+          <w:tcPr/>
+          <w:p>
+            <w:pPr>
+              <w:pStyle w:val="Compact"/>
+              <w:jc w:val="left"/>
+            </w:pPr>
+            <w:r>
+              <w:t xml:space="preserve">架构改为源-平台-目标；三层模块图；新增 AIEngine；精简架构章节</w:t>
             </w:r>
           </w:p>
         </w:tc>
@@ -789,7 +851,7 @@
         <w:pStyle w:val="Compact"/>
       </w:pPr>
       <w:r>
-        <w:t xml:space="preserve">四层逻辑架构与控制面/数据面分离设计</w:t>
+        <w:t xml:space="preserve">逻辑架构（源库 → 迁移平台 → 目标库/消息队列）与控制面/数据面分离设计</w:t>
       </w:r>
     </w:p>
     <w:p>
@@ -801,7 +863,7 @@
         <w:pStyle w:val="Compact"/>
       </w:pPr>
       <w:r>
-        <w:t xml:space="preserve">部署视图（单机、多节点）与技术选型</w:t>
+        <w:t xml:space="preserve">三层模块划分（服务接入层 / 流程编排层 / 组件层）与技术选型</w:t>
       </w:r>
     </w:p>
     <w:p>
@@ -813,7 +875,7 @@
         <w:pStyle w:val="Compact"/>
       </w:pPr>
       <w:r>
-        <w:t xml:space="preserve">Migration Core、接入编排、执行能力、横切能力、运行时与插件的模块边界</w:t>
+        <w:t xml:space="preserve">执行组件（含 AIEngine）与 Supervisor 监控边界</w:t>
       </w:r>
     </w:p>
     <w:p>
@@ -1064,6 +1126,32 @@
             </w:pPr>
             <w:r>
               <w:t xml:space="preserve">源/目标全字段对比校验组件</w:t>
+            </w:r>
+          </w:p>
+        </w:tc>
+      </w:tr>
+      <w:tr>
+        <w:tc>
+          <w:tcPr/>
+          <w:p>
+            <w:pPr>
+              <w:pStyle w:val="Compact"/>
+              <w:jc w:val="left"/>
+            </w:pPr>
+            <w:r>
+              <w:t xml:space="preserve">AIEngine</w:t>
+            </w:r>
+          </w:p>
+        </w:tc>
+        <w:tc>
+          <w:tcPr/>
+          <w:p>
+            <w:pPr>
+              <w:pStyle w:val="Compact"/>
+              <w:jc w:val="left"/>
+            </w:pPr>
+            <w:r>
+              <w:t xml:space="preserve">智能辅助组件：映射建议、异常诊断与差异解释</w:t>
             </w:r>
           </w:p>
         </w:tc>
@@ -1720,7 +1808,7 @@
         <w:t xml:space="preserve">分层解耦</w:t>
       </w:r>
       <w:r>
-        <w:t xml:space="preserve">：服务接入层、流程编排层、执行引擎层、基础设施层职责清晰，各层可独立演进与扩缩容。</w:t>
+        <w:t xml:space="preserve">：服务接入层、流程编排层、组件层职责清晰，各层可独立演进。</w:t>
       </w:r>
     </w:p>
     <w:p>
@@ -1812,6 +1900,25 @@
       </w:r>
       <w:r>
         <w:t xml:space="preserve">：编排、调度、元数据属于控制平面；实际读写与日志消费属于数据平面，便于独立扩缩与故障隔离。</w:t>
+      </w:r>
+    </w:p>
+    <w:p>
+      <w:pPr>
+        <w:numPr>
+          <w:ilvl w:val="0"/>
+          <w:numId w:val="1005"/>
+        </w:numPr>
+        <w:pStyle w:val="Compact"/>
+      </w:pPr>
+      <w:r>
+        <w:rPr>
+          <w:bCs/>
+          <w:b/>
+        </w:rPr>
+        <w:t xml:space="preserve">智能辅助</w:t>
+      </w:r>
+      <w:r>
+        <w:t xml:space="preserve">：AIEngine 提供映射与诊断建议，默认人工确认，不替代确定性执行链路。</w:t>
       </w:r>
     </w:p>
     <w:p>
@@ -2039,6 +2146,32 @@
           </w:p>
         </w:tc>
       </w:tr>
+      <w:tr>
+        <w:tc>
+          <w:tcPr/>
+          <w:p>
+            <w:pPr>
+              <w:pStyle w:val="Compact"/>
+              <w:jc w:val="left"/>
+            </w:pPr>
+            <w:r>
+              <w:t xml:space="preserve">智能辅助</w:t>
+            </w:r>
+          </w:p>
+        </w:tc>
+        <w:tc>
+          <w:tcPr/>
+          <w:p>
+            <w:pPr>
+              <w:pStyle w:val="Compact"/>
+              <w:jc w:val="left"/>
+            </w:pPr>
+            <w:r>
+              <w:t xml:space="preserve">AIEngine 提供映射建议、异常诊断与校验差异解释</w:t>
+            </w:r>
+          </w:p>
+        </w:tc>
+      </w:tr>
     </w:tbl>
     <w:p>
       <w:r>
@@ -2049,7 +2182,7 @@
     </w:p>
     <w:bookmarkEnd w:id="30"/>
     <w:bookmarkEnd w:id="31"/>
-    <w:bookmarkStart w:id="55" w:name="系统架构设计"/>
+    <w:bookmarkStart w:id="46" w:name="系统架构设计"/>
     <w:p>
       <w:pPr>
         <w:pStyle w:val="Heading2"/>
@@ -2072,7 +2205,7 @@
         <w:pStyle w:val="FirstParagraph"/>
       </w:pPr>
       <w:r>
-        <w:t xml:space="preserve">架构设计以「端到端可编排、执行可扩展、运行可观测」为目标：控制平面负责任务意图与状态，数据平面负责吞吐与延迟；执行能力通过插件适配异构库，横切能力保障调度、资源、HA 与监控。约束方面，平台需同时支持单机 PoC 与多节点生产部署，元数据为权威状态源，增量链路必须支持位点衔接与组件级高可用。</w:t>
+        <w:t xml:space="preserve">架构设计以「端到端可编排、执行可扩展、运行可观测、智能可辅助」为目标：左侧对接源库，中间为迁移平台，右侧输出到目标库或消息队列。控制平面负责任务意图与状态，数据平面负责吞吐与延迟；元数据为权威状态源；增量链路必须支持位点衔接与组件级高可用；AI 仅作辅助决策，不替代核心执行链路。</w:t>
       </w:r>
     </w:p>
     <w:bookmarkEnd w:id="32"/>
@@ -2100,13 +2233,13 @@
           <w:bCs/>
           <w:b/>
         </w:rPr>
-        <w:t xml:space="preserve">四层架构 + 数据平面</w:t>
+        <w:t xml:space="preserve">源库 → 迁移平台 → 目标库/消息队列</w:t>
       </w:r>
       <w:r>
         <w:t xml:space="preserve"> </w:t>
       </w:r>
       <w:r>
-        <w:t xml:space="preserve">模型：自上而下为服务接入层、流程编排层、执行引擎层、基础设施层；源库、目标库与增量日志存储构成独立数据平面。</w:t>
+        <w:t xml:space="preserve">的端到端结构。平台内部自上而下划分为：集中管控、基础服务、结构与全量、增量日志管道，以及 AI 智能辅助。</w:t>
       </w:r>
     </w:p>
     <w:p>
@@ -2116,7 +2249,7 @@
       <w:r>
         <w:drawing>
           <wp:inline>
-            <wp:extent cx="5334000" cy="4143099"/>
+            <wp:extent cx="5334000" cy="6139525"/>
             <wp:effectExtent b="0" l="0" r="0" t="0"/>
             <wp:docPr descr="图3-1 系统逻辑架构图" title="" id="34" name="Picture"/>
             <a:graphic>
@@ -2137,7 +2270,7 @@
                   <pic:spPr bwMode="auto">
                     <a:xfrm>
                       <a:off x="0" y="0"/>
-                      <a:ext cx="5334000" cy="4143099"/>
+                      <a:ext cx="5334000" cy="6139525"/>
                     </a:xfrm>
                     <a:prstGeom prst="rect">
                       <a:avLst/>
@@ -2185,10 +2318,10 @@
           <w:bCs/>
           <w:b/>
         </w:rPr>
-        <w:t xml:space="preserve">服务接入层</w:t>
-      </w:r>
-      <w:r>
-        <w:t xml:space="preserve">面向用户与外部系统，提供控制台 UI、统一 API 网关与认证鉴权。该层不承载迁移业务逻辑，而是将操作请求规范化后下发至编排层，并回传任务状态、进度与告警信息。通过网关集中处理鉴权、限流、路由与审计，业务服务可专注领域能力。</w:t>
+        <w:t xml:space="preserve">集中管控</w:t>
+      </w:r>
+      <w:r>
+        <w:t xml:space="preserve">提供控制台、OpenAPI 与认证鉴权，是用户与运维的统一入口，负责任务创建、进度查看与告警处置，不直接搬运业务数据。</w:t>
       </w:r>
     </w:p>
     <w:p>
@@ -2200,10 +2333,10 @@
           <w:bCs/>
           <w:b/>
         </w:rPr>
-        <w:t xml:space="preserve">流程编排层</w:t>
-      </w:r>
-      <w:r>
-        <w:t xml:space="preserve">是迁移任务的「大脑」，包含任务编排服务、工作流服务、元数据服务与数据源注册中心。编排服务维护 MigrationProject / MigrationTask 生命周期；工作流以状态机驱动各阶段子任务；元数据服务持久化配置、位点、映射与组件注册；数据源注册中心统一管理连接与凭证。该层只做决策与状态管理，不直接搬运业务数据。</w:t>
+        <w:t xml:space="preserve">基础服务</w:t>
+      </w:r>
+      <w:r>
+        <w:t xml:space="preserve">包括集群管理、资源管理、高可用与元数据管理，为迁移组件提供注册、配额、选主与配置/位点持久化能力。</w:t>
       </w:r>
     </w:p>
     <w:p>
@@ -2215,10 +2348,10 @@
           <w:bCs/>
           <w:b/>
         </w:rPr>
-        <w:t xml:space="preserve">执行引擎层</w:t>
-      </w:r>
-      <w:r>
-        <w:t xml:space="preserve">落实具体迁移动作，包括 DBCat（结构）、FullImport（全量）、Store（增量拉取）、IncrSync（增量应用）与 FullVerification（校验）。各组件由工作流按阶段启动，通过 SyncWorker / StreamRuntime 与插件完成读写。执行层向上回报进度与完成事件，向下访问源/目标库及增量日志存储。</w:t>
+        <w:t xml:space="preserve">结构与全量</w:t>
+      </w:r>
+      <w:r>
+        <w:t xml:space="preserve">覆盖结构采集与转化、结构迁移以及全量数据流：先完成 Schema 落地，再按切片并发搬运存量数据，并在全量启动时记录增量起始位点。</w:t>
       </w:r>
     </w:p>
     <w:p>
@@ -2230,10 +2363,10 @@
           <w:bCs/>
           <w:b/>
         </w:rPr>
-        <w:t xml:space="preserve">基础设施层</w:t>
-      </w:r>
-      <w:r>
-        <w:t xml:space="preserve">为上层提供调度器、资源池、HA 组件、监控告警与 Supervisor 等横切支撑。调度器将作业分配到 Worker；资源池管理配额与弹性；HA 与 Supervisor 保障 Store / IncrSync 可用性；监控告警汇聚吞吐、延迟与健康指标。</w:t>
+        <w:t xml:space="preserve">增量管道</w:t>
+      </w:r>
+      <w:r>
+        <w:t xml:space="preserve">分为日志读取与同步写入两侧：读取侧完成 Reader → Filter → Queue；写入侧完成 Filter → Mapping → 冲突检测，两侧通过队列解耦，保障变更持续追平。</w:t>
       </w:r>
     </w:p>
     <w:p>
@@ -2245,10 +2378,25 @@
           <w:bCs/>
           <w:b/>
         </w:rPr>
-        <w:t xml:space="preserve">层间交互</w:t>
-      </w:r>
-      <w:r>
-        <w:t xml:space="preserve">：用户经接入层发起任务 → 编排层完成预检查并推进状态机 → 调度器为执行组件申请资源 → 执行引擎在数据平面读写 → 位点与状态回写元数据 → 监控与 HA 持续守护运行态。控制指令自上而下，状态与指标自下而上，形成闭环。</w:t>
+        <w:t xml:space="preserve">AI 智能</w:t>
+      </w:r>
+      <w:r>
+        <w:t xml:space="preserve">为结构映射与运维诊断提供建议（类型映射/DDL 改写、失败归因、差异解释），结果供 DBCat、编排或人工确认，不阻断主链路。</w:t>
+      </w:r>
+    </w:p>
+    <w:p>
+      <w:pPr>
+        <w:pStyle w:val="BodyText"/>
+      </w:pPr>
+      <w:r>
+        <w:rPr>
+          <w:bCs/>
+          <w:b/>
+        </w:rPr>
+        <w:t xml:space="preserve">数据出口</w:t>
+      </w:r>
+      <w:r>
+        <w:t xml:space="preserve">：迁移结果写入目标数据库；也可将变更投递至消息队列，供下游消费。</w:t>
       </w:r>
     </w:p>
     <w:bookmarkEnd w:id="36"/>
@@ -2263,12 +2411,36 @@
     </w:p>
     <w:p>
       <w:pPr>
+        <w:pStyle w:val="FirstParagraph"/>
+      </w:pPr>
+      <w:r>
+        <w:t xml:space="preserve">模块按</w:t>
+      </w:r>
+      <w:r>
+        <w:t xml:space="preserve"> </w:t>
+      </w:r>
+      <w:r>
+        <w:rPr>
+          <w:bCs/>
+          <w:b/>
+        </w:rPr>
+        <w:t xml:space="preserve">服务接入层 → 流程编排层 → 组件层</w:t>
+      </w:r>
+      <w:r>
+        <w:t xml:space="preserve"> </w:t>
+      </w:r>
+      <w:r>
+        <w:t xml:space="preserve">三层组织，组件层由 Supervisor 统一监控。</w:t>
+      </w:r>
+    </w:p>
+    <w:p>
+      <w:pPr>
         <w:pStyle w:val="CaptionedFigure"/>
       </w:pPr>
       <w:r>
         <w:drawing>
           <wp:inline>
-            <wp:extent cx="5334000" cy="1109965"/>
+            <wp:extent cx="3340100" cy="25196800"/>
             <wp:effectExtent b="0" l="0" r="0" t="0"/>
             <wp:docPr descr="图3-2 模块组成图" title="" id="38" name="Picture"/>
             <a:graphic>
@@ -2289,7 +2461,7 @@
                   <pic:spPr bwMode="auto">
                     <a:xfrm>
                       <a:off x="0" y="0"/>
-                      <a:ext cx="5334000" cy="1109965"/>
+                      <a:ext cx="3340100" cy="25196800"/>
                     </a:xfrm>
                     <a:prstGeom prst="rect">
                       <a:avLst/>
@@ -2333,91 +2505,68 @@
         <w:pStyle w:val="BodyText"/>
       </w:pPr>
       <w:r>
-        <w:t xml:space="preserve">模块组成采用分层嵌套布局：</w:t>
-      </w:r>
-    </w:p>
-    <w:p>
-      <w:pPr>
-        <w:numPr>
-          <w:ilvl w:val="0"/>
-          <w:numId w:val="1006"/>
-        </w:numPr>
-        <w:pStyle w:val="Compact"/>
-      </w:pPr>
-      <w:r>
         <w:rPr>
           <w:bCs/>
           <w:b/>
         </w:rPr>
-        <w:t xml:space="preserve">外层「迁移平台」</w:t>
-      </w:r>
-      <w:r>
-        <w:t xml:space="preserve">：完整系统边界。</w:t>
-      </w:r>
-    </w:p>
-    <w:p>
-      <w:pPr>
-        <w:numPr>
-          <w:ilvl w:val="0"/>
-          <w:numId w:val="1006"/>
-        </w:numPr>
-        <w:pStyle w:val="Compact"/>
+        <w:t xml:space="preserve">服务接入层</w:t>
+      </w:r>
+      <w:r>
+        <w:t xml:space="preserve">：传输项目管理、数据源管理、运维监控、告警设置。面向用户与运维，完成项目配置、连接管理与可观测入口。</w:t>
+      </w:r>
+    </w:p>
+    <w:p>
+      <w:pPr>
+        <w:pStyle w:val="BodyText"/>
       </w:pPr>
       <w:r>
         <w:rPr>
           <w:bCs/>
           <w:b/>
         </w:rPr>
-        <w:t xml:space="preserve">内层「迁移框架」</w:t>
-      </w:r>
-      <w:r>
-        <w:t xml:space="preserve">：中部为功能模块（接入与编排、结构与元数据、全量与校验、增量同步）；侧向为横切能力（监控、调度与 HA、Supervisor）；底部为 Migration Core。</w:t>
-      </w:r>
-    </w:p>
-    <w:p>
-      <w:pPr>
-        <w:numPr>
-          <w:ilvl w:val="0"/>
-          <w:numId w:val="1006"/>
-        </w:numPr>
-        <w:pStyle w:val="Compact"/>
+        <w:t xml:space="preserve">流程编排层</w:t>
+      </w:r>
+      <w:r>
+        <w:t xml:space="preserve">：数据库对象迁移、数据迁移、数据同步、数据校验、链路切换。以状态机驱动端到端阶段，负责任务门控、并行策略与失败重试，不直接读写业务数据。</w:t>
+      </w:r>
+    </w:p>
+    <w:p>
+      <w:pPr>
+        <w:pStyle w:val="BodyText"/>
       </w:pPr>
       <w:r>
         <w:rPr>
           <w:bCs/>
           <w:b/>
         </w:rPr>
-        <w:t xml:space="preserve">Migration Core</w:t>
-      </w:r>
-      <w:r>
-        <w:t xml:space="preserve">：Record 模型、Channel、插件容器、配置中心、通信统计。</w:t>
-      </w:r>
-    </w:p>
-    <w:p>
-      <w:pPr>
-        <w:numPr>
-          <w:ilvl w:val="0"/>
-          <w:numId w:val="1006"/>
-        </w:numPr>
-        <w:pStyle w:val="Compact"/>
-      </w:pPr>
+        <w:t xml:space="preserve">组件层</w:t>
+      </w:r>
+      <w:r>
+        <w:t xml:space="preserve">：DBCat（转换引擎）、Store（增量拉取）、FullImport（全量导入）、IncrSync（增量同步）、FullVerification（全量校验）、AIEngine（智能辅助）。各组件由编排层按阶段调度，由</w:t>
+      </w:r>
+      <w:r>
+        <w:t xml:space="preserve"> </w:t>
+      </w:r>
       <w:r>
         <w:rPr>
           <w:bCs/>
           <w:b/>
         </w:rPr>
-        <w:t xml:space="preserve">外部系统</w:t>
-      </w:r>
-      <w:r>
-        <w:t xml:space="preserve">：源库、目标库、元库、消息与对象存储，由平台受控访问。</w:t>
-      </w:r>
-    </w:p>
-    <w:p>
-      <w:pPr>
-        <w:pStyle w:val="FirstParagraph"/>
-      </w:pPr>
-      <w:r>
-        <w:t xml:space="preserve">主链路：控制台 → API → 任务编排 / 工作流 → 执行模块 → 源/目标库；元数据与监控贯穿全程。</w:t>
+        <w:t xml:space="preserve">Supervisor</w:t>
+      </w:r>
+      <w:r>
+        <w:t xml:space="preserve"> </w:t>
+      </w:r>
+      <w:r>
+        <w:t xml:space="preserve">统一监控健康并触发 HA。</w:t>
+      </w:r>
+    </w:p>
+    <w:p>
+      <w:pPr>
+        <w:pStyle w:val="BodyText"/>
+      </w:pPr>
+      <w:r>
+        <w:t xml:space="preserve">主链路：接入层创建项目 → 编排层推进阶段 → 组件层执行 → Supervisor 守护；AIEngine 在结构映射与异常/差异分析时被编排或组件调用。</w:t>
       </w:r>
     </w:p>
     <w:bookmarkEnd w:id="40"/>
@@ -2509,7 +2658,7 @@
         <w:t xml:space="preserve">控制平面</w:t>
       </w:r>
       <w:r>
-        <w:t xml:space="preserve">包含 API 服务、编排引擎、工作流、调度器、元数据库与认证鉴权，负责任务意图表达、阶段推进、资源配置与状态持久化。控制平面不承载大流量数据拷贝，其可用性优先于吞吐。</w:t>
+        <w:t xml:space="preserve">包含接入层、编排层、调度器、元数据、认证鉴权与 AI 建议服务，负责任务意图、阶段推进、资源配置与状态持久化，不承载大流量数据拷贝。</w:t>
       </w:r>
     </w:p>
     <w:p>
@@ -2524,7 +2673,7 @@
         <w:t xml:space="preserve">数据平面</w:t>
       </w:r>
       <w:r>
-        <w:t xml:space="preserve">包含 SyncWorker、StreamRuntime、执行组件进程以及源/目标数据库与增量日志存储，负责实际数据读写、日志解析与 Record 应用。数据平面按吞吐与延迟目标独立扩缩。</w:t>
+        <w:t xml:space="preserve">包含 FullImport / Store / IncrSync / FullVerification 等执行进程以及源/目标库与日志队列，负责实际读写、解析与 Record 应用，按吞吐与延迟目标独立扩缩。</w:t>
       </w:r>
     </w:p>
     <w:p>
@@ -2539,205 +2688,17 @@
         <w:t xml:space="preserve">边界与交互</w:t>
       </w:r>
       <w:r>
-        <w:t xml:space="preserve">：控制平面通过调度器下发作业规格与启停指令；数据平面通过回调与位点上报回写元数据；Supervisor / HA 在数据平面异常时由控制平面决策重建。两者解耦后，编排升级不影响在途数据作业，Worker 扩容也不必改动控制服务拓扑。</w:t>
+        <w:t xml:space="preserve">：控制平面下发作业规格与启停指令；数据平面回写位点与进度；Supervisor / HA 在数据平面异常时由控制平面决策重建。AIEngine 读取元数据与监控摘要，输出建议报告，不直接写入业务库。</w:t>
       </w:r>
     </w:p>
     <w:bookmarkEnd w:id="44"/>
-    <w:bookmarkStart w:id="53" w:name="部署视图"/>
+    <w:bookmarkStart w:id="45" w:name="技术选型"/>
     <w:p>
       <w:pPr>
         <w:pStyle w:val="Heading3"/>
       </w:pPr>
       <w:r>
-        <w:t xml:space="preserve">3.5 部署视图</w:t>
-      </w:r>
-    </w:p>
-    <w:bookmarkStart w:id="48" w:name="单机部署"/>
-    <w:p>
-      <w:pPr>
-        <w:pStyle w:val="Heading4"/>
-      </w:pPr>
-      <w:r>
-        <w:t xml:space="preserve">3.5.1 单机部署</w:t>
-      </w:r>
-    </w:p>
-    <w:p>
-      <w:pPr>
-        <w:pStyle w:val="CaptionedFigure"/>
-      </w:pPr>
-      <w:r>
-        <w:drawing>
-          <wp:inline>
-            <wp:extent cx="5334000" cy="4539915"/>
-            <wp:effectExtent b="0" l="0" r="0" t="0"/>
-            <wp:docPr descr="图3-4 单机部署架构图" title="" id="46" name="Picture"/>
-            <a:graphic>
-              <a:graphicData uri="http://schemas.openxmlformats.org/drawingml/2006/picture">
-                <pic:pic>
-                  <pic:nvPicPr>
-                    <pic:cNvPr descr="images/fig3-4-single-node-deploy.png" id="47" name="Picture"/>
-                    <pic:cNvPicPr>
-                      <a:picLocks noChangeArrowheads="1" noChangeAspect="1"/>
-                    </pic:cNvPicPr>
-                  </pic:nvPicPr>
-                  <pic:blipFill>
-                    <a:blip r:embed="rId45"/>
-                    <a:stretch>
-                      <a:fillRect/>
-                    </a:stretch>
-                  </pic:blipFill>
-                  <pic:spPr bwMode="auto">
-                    <a:xfrm>
-                      <a:off x="0" y="0"/>
-                      <a:ext cx="5334000" cy="4539915"/>
-                    </a:xfrm>
-                    <a:prstGeom prst="rect">
-                      <a:avLst/>
-                    </a:prstGeom>
-                    <a:noFill/>
-                    <a:ln w="9525">
-                      <a:noFill/>
-                      <a:headEnd/>
-                      <a:tailEnd/>
-                    </a:ln>
-                  </pic:spPr>
-                </pic:pic>
-              </a:graphicData>
-            </a:graphic>
-          </wp:inline>
-        </w:drawing>
-      </w:r>
-    </w:p>
-    <w:p>
-      <w:pPr>
-        <w:pStyle w:val="ImageCaption"/>
-      </w:pPr>
-      <w:r>
-        <w:t xml:space="preserve">图3-4 单机部署架构图</w:t>
-      </w:r>
-    </w:p>
-    <w:p>
-      <w:pPr>
-        <w:pStyle w:val="BodyText"/>
-      </w:pPr>
-      <w:r>
-        <w:rPr>
-          <w:bCs/>
-          <w:b/>
-        </w:rPr>
-        <w:t xml:space="preserve">图 3-4 单机部署架构图</w:t>
-      </w:r>
-    </w:p>
-    <w:p>
-      <w:pPr>
-        <w:pStyle w:val="BodyText"/>
-      </w:pPr>
-      <w:r>
-        <w:t xml:space="preserve">单机（All-in-One）模式将控制台、API、编排服务、元数据库、SyncWorker 与 StreamRuntime 部署于同一节点，适用于开发调试与 PoC 验证。该模式下 HA 可关闭，重点验证流程正确性与插件连通性。</w:t>
-      </w:r>
-    </w:p>
-    <w:bookmarkEnd w:id="48"/>
-    <w:bookmarkStart w:id="52" w:name="多节点部署"/>
-    <w:p>
-      <w:pPr>
-        <w:pStyle w:val="Heading4"/>
-      </w:pPr>
-      <w:r>
-        <w:t xml:space="preserve">3.5.2 多节点部署</w:t>
-      </w:r>
-    </w:p>
-    <w:p>
-      <w:pPr>
-        <w:pStyle w:val="CaptionedFigure"/>
-      </w:pPr>
-      <w:r>
-        <w:drawing>
-          <wp:inline>
-            <wp:extent cx="5334000" cy="2474976"/>
-            <wp:effectExtent b="0" l="0" r="0" t="0"/>
-            <wp:docPr descr="图3-5 多节点 HA 部署架构图" title="" id="50" name="Picture"/>
-            <a:graphic>
-              <a:graphicData uri="http://schemas.openxmlformats.org/drawingml/2006/picture">
-                <pic:pic>
-                  <pic:nvPicPr>
-                    <pic:cNvPr descr="images/fig3-5-multi-node-ha.png" id="51" name="Picture"/>
-                    <pic:cNvPicPr>
-                      <a:picLocks noChangeArrowheads="1" noChangeAspect="1"/>
-                    </pic:cNvPicPr>
-                  </pic:nvPicPr>
-                  <pic:blipFill>
-                    <a:blip r:embed="rId49"/>
-                    <a:stretch>
-                      <a:fillRect/>
-                    </a:stretch>
-                  </pic:blipFill>
-                  <pic:spPr bwMode="auto">
-                    <a:xfrm>
-                      <a:off x="0" y="0"/>
-                      <a:ext cx="5334000" cy="2474976"/>
-                    </a:xfrm>
-                    <a:prstGeom prst="rect">
-                      <a:avLst/>
-                    </a:prstGeom>
-                    <a:noFill/>
-                    <a:ln w="9525">
-                      <a:noFill/>
-                      <a:headEnd/>
-                      <a:tailEnd/>
-                    </a:ln>
-                  </pic:spPr>
-                </pic:pic>
-              </a:graphicData>
-            </a:graphic>
-          </wp:inline>
-        </w:drawing>
-      </w:r>
-    </w:p>
-    <w:p>
-      <w:pPr>
-        <w:pStyle w:val="ImageCaption"/>
-      </w:pPr>
-      <w:r>
-        <w:t xml:space="preserve">图3-5 多节点 HA 部署架构图</w:t>
-      </w:r>
-    </w:p>
-    <w:p>
-      <w:pPr>
-        <w:pStyle w:val="BodyText"/>
-      </w:pPr>
-      <w:r>
-        <w:rPr>
-          <w:bCs/>
-          <w:b/>
-        </w:rPr>
-        <w:t xml:space="preserve">图 3-5 多节点 HA 部署架构图</w:t>
-      </w:r>
-    </w:p>
-    <w:p>
-      <w:pPr>
-        <w:pStyle w:val="BodyText"/>
-      </w:pPr>
-      <w:r>
-        <w:t xml:space="preserve">生产环境采用多节点部署：接入与编排服务经负载均衡/VIP 对外提供；元数据库与协调服务（ZooKeeper / etcd）独立高可用；Worker 节点池承载 SyncWorker 与 StreamRuntime；每台 Worker 部署 Supervisor。Store 宜靠近源端，IncrSync 宜靠近目标端，由调度亲和策略落实。Store / IncrSync 支持跨节点 HA 切换。</w:t>
-      </w:r>
-    </w:p>
-    <w:p>
-      <w:pPr>
-        <w:pStyle w:val="BodyText"/>
-      </w:pPr>
-      <w:r>
-        <w:t xml:space="preserve">多地域场景（演进项）可将 Store 部署在源端地域、IncrSync 部署在目标端地域，由统一元数据与集群管理跨地域协调。</w:t>
-      </w:r>
-    </w:p>
-    <w:bookmarkEnd w:id="52"/>
-    <w:bookmarkEnd w:id="53"/>
-    <w:bookmarkStart w:id="54" w:name="技术选型"/>
-    <w:p>
-      <w:pPr>
-        <w:pStyle w:val="Heading3"/>
-      </w:pPr>
-      <w:r>
-        <w:t xml:space="preserve">3.6 技术选型</w:t>
+        <w:t xml:space="preserve">3.5 技术选型</w:t>
       </w:r>
     </w:p>
     <w:tbl>
@@ -2916,6 +2877,44 @@
               <w:jc w:val="left"/>
             </w:pPr>
             <w:r>
+              <w:t xml:space="preserve">AI 推理</w:t>
+            </w:r>
+          </w:p>
+        </w:tc>
+        <w:tc>
+          <w:tcPr/>
+          <w:p>
+            <w:pPr>
+              <w:pStyle w:val="Compact"/>
+              <w:jc w:val="left"/>
+            </w:pPr>
+            <w:r>
+              <w:t xml:space="preserve">本地或远程 LLM API</w:t>
+            </w:r>
+          </w:p>
+        </w:tc>
+        <w:tc>
+          <w:tcPr/>
+          <w:p>
+            <w:pPr>
+              <w:pStyle w:val="Compact"/>
+              <w:jc w:val="left"/>
+            </w:pPr>
+            <w:r>
+              <w:t xml:space="preserve">映射建议、日志诊断与差异解释</w:t>
+            </w:r>
+          </w:p>
+        </w:tc>
+      </w:tr>
+      <w:tr>
+        <w:tc>
+          <w:tcPr/>
+          <w:p>
+            <w:pPr>
+              <w:pStyle w:val="Compact"/>
+              <w:jc w:val="left"/>
+            </w:pPr>
+            <w:r>
               <w:t xml:space="preserve">前端控制台</w:t>
             </w:r>
           </w:p>
@@ -3093,44 +3092,6 @@
             </w:pPr>
             <w:r>
               <w:t xml:space="preserve">HA 选主、组件注册</w:t>
-            </w:r>
-          </w:p>
-        </w:tc>
-      </w:tr>
-      <w:tr>
-        <w:tc>
-          <w:tcPr/>
-          <w:p>
-            <w:pPr>
-              <w:pStyle w:val="Compact"/>
-              <w:jc w:val="left"/>
-            </w:pPr>
-            <w:r>
-              <w:t xml:space="preserve">容器编排</w:t>
-            </w:r>
-          </w:p>
-        </w:tc>
-        <w:tc>
-          <w:tcPr/>
-          <w:p>
-            <w:pPr>
-              <w:pStyle w:val="Compact"/>
-              <w:jc w:val="left"/>
-            </w:pPr>
-            <w:r>
-              <w:t xml:space="preserve">Kubernetes</w:t>
-            </w:r>
-          </w:p>
-        </w:tc>
-        <w:tc>
-          <w:tcPr/>
-          <w:p>
-            <w:pPr>
-              <w:pStyle w:val="Compact"/>
-              <w:jc w:val="left"/>
-            </w:pPr>
-            <w:r>
-              <w:t xml:space="preserve">Worker 节点弹性调度</w:t>
             </w:r>
           </w:p>
         </w:tc>
@@ -3143,9 +3104,9 @@
         </w:pict>
       </w:r>
     </w:p>
-    <w:bookmarkEnd w:id="54"/>
-    <w:bookmarkEnd w:id="55"/>
-    <w:bookmarkStart w:id="82" w:name="模块设计"/>
+    <w:bookmarkEnd w:id="45"/>
+    <w:bookmarkEnd w:id="46"/>
+    <w:bookmarkStart w:id="74" w:name="模块设计"/>
     <w:p>
       <w:pPr>
         <w:pStyle w:val="Heading2"/>
@@ -3169,7 +3130,7 @@
           <w:bCs/>
           <w:b/>
         </w:rPr>
-        <w:t xml:space="preserve">Migration Core、接入与编排、执行能力、横切能力、运行时与插件</w:t>
+        <w:t xml:space="preserve">Migration Core、接入与编排、执行能力（含 AIEngine）、横切能力、运行时与插件</w:t>
       </w:r>
       <w:r>
         <w:t xml:space="preserve"> </w:t>
@@ -3178,7 +3139,7 @@
         <w:t xml:space="preserve">分区介绍。各模块仅描述职责、能力要点与对外接口。</w:t>
       </w:r>
     </w:p>
-    <w:bookmarkStart w:id="56" w:name="migration-core核心层"/>
+    <w:bookmarkStart w:id="47" w:name="migration-core核心层"/>
     <w:p>
       <w:pPr>
         <w:pStyle w:val="Heading3"/>
@@ -3199,7 +3160,7 @@
       <w:pPr>
         <w:numPr>
           <w:ilvl w:val="0"/>
-          <w:numId w:val="1007"/>
+          <w:numId w:val="1006"/>
         </w:numPr>
         <w:pStyle w:val="Compact"/>
       </w:pPr>
@@ -3218,7 +3179,7 @@
       <w:pPr>
         <w:numPr>
           <w:ilvl w:val="0"/>
-          <w:numId w:val="1007"/>
+          <w:numId w:val="1006"/>
         </w:numPr>
         <w:pStyle w:val="Compact"/>
       </w:pPr>
@@ -3237,7 +3198,7 @@
       <w:pPr>
         <w:numPr>
           <w:ilvl w:val="0"/>
-          <w:numId w:val="1007"/>
+          <w:numId w:val="1006"/>
         </w:numPr>
         <w:pStyle w:val="Compact"/>
       </w:pPr>
@@ -3271,7 +3232,7 @@
       <w:pPr>
         <w:numPr>
           <w:ilvl w:val="0"/>
-          <w:numId w:val="1007"/>
+          <w:numId w:val="1006"/>
         </w:numPr>
         <w:pStyle w:val="Compact"/>
       </w:pPr>
@@ -3290,7 +3251,7 @@
       <w:pPr>
         <w:numPr>
           <w:ilvl w:val="0"/>
-          <w:numId w:val="1007"/>
+          <w:numId w:val="1006"/>
         </w:numPr>
         <w:pStyle w:val="Compact"/>
       </w:pPr>
@@ -3312,8 +3273,8 @@
         </w:pict>
       </w:r>
     </w:p>
-    <w:bookmarkEnd w:id="56"/>
-    <w:bookmarkStart w:id="64" w:name="接入与编排"/>
+    <w:bookmarkEnd w:id="47"/>
+    <w:bookmarkStart w:id="55" w:name="接入与编排"/>
     <w:p>
       <w:pPr>
         <w:pStyle w:val="Heading3"/>
@@ -3322,7 +3283,7 @@
         <w:t xml:space="preserve">4.1 接入与编排</w:t>
       </w:r>
     </w:p>
-    <w:bookmarkStart w:id="57" w:name="控制台-ui"/>
+    <w:bookmarkStart w:id="48" w:name="控制台-ui"/>
     <w:p>
       <w:pPr>
         <w:pStyle w:val="Heading4"/>
@@ -3367,7 +3328,7 @@
       <w:pPr>
         <w:numPr>
           <w:ilvl w:val="0"/>
-          <w:numId w:val="1008"/>
+          <w:numId w:val="1007"/>
         </w:numPr>
         <w:pStyle w:val="Compact"/>
       </w:pPr>
@@ -3379,7 +3340,7 @@
       <w:pPr>
         <w:numPr>
           <w:ilvl w:val="0"/>
-          <w:numId w:val="1008"/>
+          <w:numId w:val="1007"/>
         </w:numPr>
         <w:pStyle w:val="Compact"/>
       </w:pPr>
@@ -3391,7 +3352,7 @@
       <w:pPr>
         <w:numPr>
           <w:ilvl w:val="0"/>
-          <w:numId w:val="1008"/>
+          <w:numId w:val="1007"/>
         </w:numPr>
         <w:pStyle w:val="Compact"/>
       </w:pPr>
@@ -3403,7 +3364,7 @@
       <w:pPr>
         <w:numPr>
           <w:ilvl w:val="0"/>
-          <w:numId w:val="1008"/>
+          <w:numId w:val="1007"/>
         </w:numPr>
         <w:pStyle w:val="Compact"/>
       </w:pPr>
@@ -3415,7 +3376,7 @@
       <w:pPr>
         <w:numPr>
           <w:ilvl w:val="0"/>
-          <w:numId w:val="1008"/>
+          <w:numId w:val="1007"/>
         </w:numPr>
         <w:pStyle w:val="Compact"/>
       </w:pPr>
@@ -3439,7 +3400,7 @@
       <w:pPr>
         <w:numPr>
           <w:ilvl w:val="0"/>
-          <w:numId w:val="1009"/>
+          <w:numId w:val="1008"/>
         </w:numPr>
         <w:pStyle w:val="Compact"/>
       </w:pPr>
@@ -3451,7 +3412,7 @@
       <w:pPr>
         <w:numPr>
           <w:ilvl w:val="0"/>
-          <w:numId w:val="1009"/>
+          <w:numId w:val="1008"/>
         </w:numPr>
         <w:pStyle w:val="Compact"/>
       </w:pPr>
@@ -3463,7 +3424,7 @@
       <w:pPr>
         <w:numPr>
           <w:ilvl w:val="0"/>
-          <w:numId w:val="1009"/>
+          <w:numId w:val="1008"/>
         </w:numPr>
         <w:pStyle w:val="Compact"/>
       </w:pPr>
@@ -3471,8 +3432,8 @@
         <w:t xml:space="preserve">依赖：API 网关</w:t>
       </w:r>
     </w:p>
-    <w:bookmarkEnd w:id="57"/>
-    <w:bookmarkStart w:id="58" w:name="api-网关"/>
+    <w:bookmarkEnd w:id="48"/>
+    <w:bookmarkStart w:id="49" w:name="api-网关"/>
     <w:p>
       <w:pPr>
         <w:pStyle w:val="Heading4"/>
@@ -3517,7 +3478,7 @@
       <w:pPr>
         <w:numPr>
           <w:ilvl w:val="0"/>
-          <w:numId w:val="1010"/>
+          <w:numId w:val="1009"/>
         </w:numPr>
         <w:pStyle w:val="Compact"/>
       </w:pPr>
@@ -3541,7 +3502,7 @@
       <w:pPr>
         <w:numPr>
           <w:ilvl w:val="0"/>
-          <w:numId w:val="1010"/>
+          <w:numId w:val="1009"/>
         </w:numPr>
         <w:pStyle w:val="Compact"/>
       </w:pPr>
@@ -3553,7 +3514,7 @@
       <w:pPr>
         <w:numPr>
           <w:ilvl w:val="0"/>
-          <w:numId w:val="1010"/>
+          <w:numId w:val="1009"/>
         </w:numPr>
         <w:pStyle w:val="Compact"/>
       </w:pPr>
@@ -3565,7 +3526,7 @@
       <w:pPr>
         <w:numPr>
           <w:ilvl w:val="0"/>
-          <w:numId w:val="1010"/>
+          <w:numId w:val="1009"/>
         </w:numPr>
         <w:pStyle w:val="Compact"/>
       </w:pPr>
@@ -3577,7 +3538,7 @@
       <w:pPr>
         <w:numPr>
           <w:ilvl w:val="0"/>
-          <w:numId w:val="1010"/>
+          <w:numId w:val="1009"/>
         </w:numPr>
         <w:pStyle w:val="Compact"/>
       </w:pPr>
@@ -3601,7 +3562,7 @@
       <w:pPr>
         <w:numPr>
           <w:ilvl w:val="0"/>
-          <w:numId w:val="1011"/>
+          <w:numId w:val="1010"/>
         </w:numPr>
         <w:pStyle w:val="Compact"/>
       </w:pPr>
@@ -3613,7 +3574,7 @@
       <w:pPr>
         <w:numPr>
           <w:ilvl w:val="0"/>
-          <w:numId w:val="1011"/>
+          <w:numId w:val="1010"/>
         </w:numPr>
         <w:pStyle w:val="Compact"/>
       </w:pPr>
@@ -3625,7 +3586,7 @@
       <w:pPr>
         <w:numPr>
           <w:ilvl w:val="0"/>
-          <w:numId w:val="1011"/>
+          <w:numId w:val="1010"/>
         </w:numPr>
         <w:pStyle w:val="Compact"/>
       </w:pPr>
@@ -3633,8 +3594,8 @@
         <w:t xml:space="preserve">依赖：认证鉴权、任务编排、元数据服务</w:t>
       </w:r>
     </w:p>
-    <w:bookmarkEnd w:id="58"/>
-    <w:bookmarkStart w:id="59" w:name="认证鉴权"/>
+    <w:bookmarkEnd w:id="49"/>
+    <w:bookmarkStart w:id="50" w:name="认证鉴权"/>
     <w:p>
       <w:pPr>
         <w:pStyle w:val="Heading4"/>
@@ -3679,7 +3640,7 @@
       <w:pPr>
         <w:numPr>
           <w:ilvl w:val="0"/>
-          <w:numId w:val="1012"/>
+          <w:numId w:val="1011"/>
         </w:numPr>
         <w:pStyle w:val="Compact"/>
       </w:pPr>
@@ -3691,7 +3652,7 @@
       <w:pPr>
         <w:numPr>
           <w:ilvl w:val="0"/>
-          <w:numId w:val="1012"/>
+          <w:numId w:val="1011"/>
         </w:numPr>
         <w:pStyle w:val="Compact"/>
       </w:pPr>
@@ -3703,7 +3664,7 @@
       <w:pPr>
         <w:numPr>
           <w:ilvl w:val="0"/>
-          <w:numId w:val="1012"/>
+          <w:numId w:val="1011"/>
         </w:numPr>
         <w:pStyle w:val="Compact"/>
       </w:pPr>
@@ -3715,7 +3676,7 @@
       <w:pPr>
         <w:numPr>
           <w:ilvl w:val="0"/>
-          <w:numId w:val="1012"/>
+          <w:numId w:val="1011"/>
         </w:numPr>
         <w:pStyle w:val="Compact"/>
       </w:pPr>
@@ -3727,7 +3688,7 @@
       <w:pPr>
         <w:numPr>
           <w:ilvl w:val="0"/>
-          <w:numId w:val="1012"/>
+          <w:numId w:val="1011"/>
         </w:numPr>
         <w:pStyle w:val="Compact"/>
       </w:pPr>
@@ -3751,7 +3712,7 @@
       <w:pPr>
         <w:numPr>
           <w:ilvl w:val="0"/>
-          <w:numId w:val="1013"/>
+          <w:numId w:val="1012"/>
         </w:numPr>
         <w:pStyle w:val="Compact"/>
       </w:pPr>
@@ -3763,7 +3724,7 @@
       <w:pPr>
         <w:numPr>
           <w:ilvl w:val="0"/>
-          <w:numId w:val="1013"/>
+          <w:numId w:val="1012"/>
         </w:numPr>
         <w:pStyle w:val="Compact"/>
       </w:pPr>
@@ -3775,7 +3736,7 @@
       <w:pPr>
         <w:numPr>
           <w:ilvl w:val="0"/>
-          <w:numId w:val="1013"/>
+          <w:numId w:val="1012"/>
         </w:numPr>
         <w:pStyle w:val="Compact"/>
       </w:pPr>
@@ -3783,8 +3744,8 @@
         <w:t xml:space="preserve">依赖：元数据库、密钥管理（KMS）</w:t>
       </w:r>
     </w:p>
-    <w:bookmarkEnd w:id="59"/>
-    <w:bookmarkStart w:id="60" w:name="任务编排服务"/>
+    <w:bookmarkEnd w:id="50"/>
+    <w:bookmarkStart w:id="51" w:name="任务编排服务"/>
     <w:p>
       <w:pPr>
         <w:pStyle w:val="Heading4"/>
@@ -3829,7 +3790,7 @@
       <w:pPr>
         <w:numPr>
           <w:ilvl w:val="0"/>
-          <w:numId w:val="1014"/>
+          <w:numId w:val="1013"/>
         </w:numPr>
         <w:pStyle w:val="Compact"/>
       </w:pPr>
@@ -3841,7 +3802,7 @@
       <w:pPr>
         <w:numPr>
           <w:ilvl w:val="0"/>
-          <w:numId w:val="1014"/>
+          <w:numId w:val="1013"/>
         </w:numPr>
         <w:pStyle w:val="Compact"/>
       </w:pPr>
@@ -3853,7 +3814,7 @@
       <w:pPr>
         <w:numPr>
           <w:ilvl w:val="0"/>
-          <w:numId w:val="1014"/>
+          <w:numId w:val="1013"/>
         </w:numPr>
         <w:pStyle w:val="Compact"/>
       </w:pPr>
@@ -3865,7 +3826,7 @@
       <w:pPr>
         <w:numPr>
           <w:ilvl w:val="0"/>
-          <w:numId w:val="1014"/>
+          <w:numId w:val="1013"/>
         </w:numPr>
         <w:pStyle w:val="Compact"/>
       </w:pPr>
@@ -3877,7 +3838,7 @@
       <w:pPr>
         <w:numPr>
           <w:ilvl w:val="0"/>
-          <w:numId w:val="1014"/>
+          <w:numId w:val="1013"/>
         </w:numPr>
         <w:pStyle w:val="Compact"/>
       </w:pPr>
@@ -3901,7 +3862,7 @@
       <w:pPr>
         <w:numPr>
           <w:ilvl w:val="0"/>
-          <w:numId w:val="1015"/>
+          <w:numId w:val="1014"/>
         </w:numPr>
         <w:pStyle w:val="Compact"/>
       </w:pPr>
@@ -3913,7 +3874,7 @@
       <w:pPr>
         <w:numPr>
           <w:ilvl w:val="0"/>
-          <w:numId w:val="1015"/>
+          <w:numId w:val="1014"/>
         </w:numPr>
         <w:pStyle w:val="Compact"/>
       </w:pPr>
@@ -3925,7 +3886,7 @@
       <w:pPr>
         <w:numPr>
           <w:ilvl w:val="0"/>
-          <w:numId w:val="1015"/>
+          <w:numId w:val="1014"/>
         </w:numPr>
         <w:pStyle w:val="Compact"/>
       </w:pPr>
@@ -3933,8 +3894,8 @@
         <w:t xml:space="preserve">依赖：工作流、元数据、数据源注册中心、调度器</w:t>
       </w:r>
     </w:p>
-    <w:bookmarkEnd w:id="60"/>
-    <w:bookmarkStart w:id="61" w:name="工作流服务"/>
+    <w:bookmarkEnd w:id="51"/>
+    <w:bookmarkStart w:id="52" w:name="工作流服务"/>
     <w:p>
       <w:pPr>
         <w:pStyle w:val="Heading4"/>
@@ -3979,7 +3940,7 @@
       <w:pPr>
         <w:numPr>
           <w:ilvl w:val="0"/>
-          <w:numId w:val="1016"/>
+          <w:numId w:val="1015"/>
         </w:numPr>
         <w:pStyle w:val="Compact"/>
       </w:pPr>
@@ -3991,7 +3952,7 @@
       <w:pPr>
         <w:numPr>
           <w:ilvl w:val="0"/>
-          <w:numId w:val="1016"/>
+          <w:numId w:val="1015"/>
         </w:numPr>
         <w:pStyle w:val="Compact"/>
       </w:pPr>
@@ -4003,7 +3964,7 @@
       <w:pPr>
         <w:numPr>
           <w:ilvl w:val="0"/>
-          <w:numId w:val="1016"/>
+          <w:numId w:val="1015"/>
         </w:numPr>
         <w:pStyle w:val="Compact"/>
       </w:pPr>
@@ -4015,7 +3976,7 @@
       <w:pPr>
         <w:numPr>
           <w:ilvl w:val="0"/>
-          <w:numId w:val="1016"/>
+          <w:numId w:val="1015"/>
         </w:numPr>
         <w:pStyle w:val="Compact"/>
       </w:pPr>
@@ -4027,7 +3988,7 @@
       <w:pPr>
         <w:numPr>
           <w:ilvl w:val="0"/>
-          <w:numId w:val="1016"/>
+          <w:numId w:val="1015"/>
         </w:numPr>
         <w:pStyle w:val="Compact"/>
       </w:pPr>
@@ -4051,7 +4012,7 @@
       <w:pPr>
         <w:numPr>
           <w:ilvl w:val="0"/>
-          <w:numId w:val="1017"/>
+          <w:numId w:val="1016"/>
         </w:numPr>
         <w:pStyle w:val="Compact"/>
       </w:pPr>
@@ -4063,7 +4024,7 @@
       <w:pPr>
         <w:numPr>
           <w:ilvl w:val="0"/>
-          <w:numId w:val="1017"/>
+          <w:numId w:val="1016"/>
         </w:numPr>
         <w:pStyle w:val="Compact"/>
       </w:pPr>
@@ -4075,7 +4036,7 @@
       <w:pPr>
         <w:numPr>
           <w:ilvl w:val="0"/>
-          <w:numId w:val="1017"/>
+          <w:numId w:val="1016"/>
         </w:numPr>
         <w:pStyle w:val="Compact"/>
       </w:pPr>
@@ -4083,8 +4044,8 @@
         <w:t xml:space="preserve">依赖：各执行组件、调度器、元数据服务</w:t>
       </w:r>
     </w:p>
-    <w:bookmarkEnd w:id="61"/>
-    <w:bookmarkStart w:id="62" w:name="元数据服务"/>
+    <w:bookmarkEnd w:id="52"/>
+    <w:bookmarkStart w:id="53" w:name="元数据服务"/>
     <w:p>
       <w:pPr>
         <w:pStyle w:val="Heading4"/>
@@ -4129,7 +4090,7 @@
       <w:pPr>
         <w:numPr>
           <w:ilvl w:val="0"/>
-          <w:numId w:val="1018"/>
+          <w:numId w:val="1017"/>
         </w:numPr>
         <w:pStyle w:val="Compact"/>
       </w:pPr>
@@ -4141,7 +4102,7 @@
       <w:pPr>
         <w:numPr>
           <w:ilvl w:val="0"/>
-          <w:numId w:val="1018"/>
+          <w:numId w:val="1017"/>
         </w:numPr>
         <w:pStyle w:val="Compact"/>
       </w:pPr>
@@ -4165,7 +4126,7 @@
       <w:pPr>
         <w:numPr>
           <w:ilvl w:val="0"/>
-          <w:numId w:val="1018"/>
+          <w:numId w:val="1017"/>
         </w:numPr>
         <w:pStyle w:val="Compact"/>
       </w:pPr>
@@ -4177,7 +4138,7 @@
       <w:pPr>
         <w:numPr>
           <w:ilvl w:val="0"/>
-          <w:numId w:val="1018"/>
+          <w:numId w:val="1017"/>
         </w:numPr>
         <w:pStyle w:val="Compact"/>
       </w:pPr>
@@ -4189,7 +4150,7 @@
       <w:pPr>
         <w:numPr>
           <w:ilvl w:val="0"/>
-          <w:numId w:val="1018"/>
+          <w:numId w:val="1017"/>
         </w:numPr>
         <w:pStyle w:val="Compact"/>
       </w:pPr>
@@ -4213,7 +4174,7 @@
       <w:pPr>
         <w:numPr>
           <w:ilvl w:val="0"/>
-          <w:numId w:val="1019"/>
+          <w:numId w:val="1018"/>
         </w:numPr>
         <w:pStyle w:val="Compact"/>
       </w:pPr>
@@ -4225,7 +4186,7 @@
       <w:pPr>
         <w:numPr>
           <w:ilvl w:val="0"/>
-          <w:numId w:val="1019"/>
+          <w:numId w:val="1018"/>
         </w:numPr>
         <w:pStyle w:val="Compact"/>
       </w:pPr>
@@ -4237,7 +4198,7 @@
       <w:pPr>
         <w:numPr>
           <w:ilvl w:val="0"/>
-          <w:numId w:val="1019"/>
+          <w:numId w:val="1018"/>
         </w:numPr>
         <w:pStyle w:val="Compact"/>
       </w:pPr>
@@ -4245,8 +4206,8 @@
         <w:t xml:space="preserve">依赖：元数据库（MySQL / PostgreSQL）</w:t>
       </w:r>
     </w:p>
-    <w:bookmarkEnd w:id="62"/>
-    <w:bookmarkStart w:id="63" w:name="数据源注册中心"/>
+    <w:bookmarkEnd w:id="53"/>
+    <w:bookmarkStart w:id="54" w:name="数据源注册中心"/>
     <w:p>
       <w:pPr>
         <w:pStyle w:val="Heading4"/>
@@ -4291,7 +4252,7 @@
       <w:pPr>
         <w:numPr>
           <w:ilvl w:val="0"/>
-          <w:numId w:val="1020"/>
+          <w:numId w:val="1019"/>
         </w:numPr>
         <w:pStyle w:val="Compact"/>
       </w:pPr>
@@ -4303,7 +4264,7 @@
       <w:pPr>
         <w:numPr>
           <w:ilvl w:val="0"/>
-          <w:numId w:val="1020"/>
+          <w:numId w:val="1019"/>
         </w:numPr>
         <w:pStyle w:val="Compact"/>
       </w:pPr>
@@ -4315,7 +4276,7 @@
       <w:pPr>
         <w:numPr>
           <w:ilvl w:val="0"/>
-          <w:numId w:val="1020"/>
+          <w:numId w:val="1019"/>
         </w:numPr>
         <w:pStyle w:val="Compact"/>
       </w:pPr>
@@ -4327,7 +4288,7 @@
       <w:pPr>
         <w:numPr>
           <w:ilvl w:val="0"/>
-          <w:numId w:val="1020"/>
+          <w:numId w:val="1019"/>
         </w:numPr>
         <w:pStyle w:val="Compact"/>
       </w:pPr>
@@ -4339,7 +4300,7 @@
       <w:pPr>
         <w:numPr>
           <w:ilvl w:val="0"/>
-          <w:numId w:val="1020"/>
+          <w:numId w:val="1019"/>
         </w:numPr>
         <w:pStyle w:val="Compact"/>
       </w:pPr>
@@ -4363,7 +4324,7 @@
       <w:pPr>
         <w:numPr>
           <w:ilvl w:val="0"/>
-          <w:numId w:val="1021"/>
+          <w:numId w:val="1020"/>
         </w:numPr>
         <w:pStyle w:val="Compact"/>
       </w:pPr>
@@ -4375,7 +4336,7 @@
       <w:pPr>
         <w:numPr>
           <w:ilvl w:val="0"/>
-          <w:numId w:val="1021"/>
+          <w:numId w:val="1020"/>
         </w:numPr>
         <w:pStyle w:val="Compact"/>
       </w:pPr>
@@ -4387,7 +4348,7 @@
       <w:pPr>
         <w:numPr>
           <w:ilvl w:val="0"/>
-          <w:numId w:val="1021"/>
+          <w:numId w:val="1020"/>
         </w:numPr>
         <w:pStyle w:val="Compact"/>
       </w:pPr>
@@ -4402,9 +4363,9 @@
         </w:pict>
       </w:r>
     </w:p>
-    <w:bookmarkEnd w:id="63"/>
-    <w:bookmarkEnd w:id="64"/>
-    <w:bookmarkStart w:id="70" w:name="执行能力"/>
+    <w:bookmarkEnd w:id="54"/>
+    <w:bookmarkEnd w:id="55"/>
+    <w:bookmarkStart w:id="62" w:name="执行能力"/>
     <w:p>
       <w:pPr>
         <w:pStyle w:val="Heading3"/>
@@ -4413,7 +4374,7 @@
         <w:t xml:space="preserve">4.2 执行能力</w:t>
       </w:r>
     </w:p>
-    <w:bookmarkStart w:id="65" w:name="dbcat"/>
+    <w:bookmarkStart w:id="56" w:name="dbcat"/>
     <w:p>
       <w:pPr>
         <w:pStyle w:val="Heading4"/>
@@ -4458,7 +4419,7 @@
       <w:pPr>
         <w:numPr>
           <w:ilvl w:val="0"/>
-          <w:numId w:val="1022"/>
+          <w:numId w:val="1021"/>
         </w:numPr>
         <w:pStyle w:val="Compact"/>
       </w:pPr>
@@ -4470,7 +4431,7 @@
       <w:pPr>
         <w:numPr>
           <w:ilvl w:val="0"/>
-          <w:numId w:val="1022"/>
+          <w:numId w:val="1021"/>
         </w:numPr>
         <w:pStyle w:val="Compact"/>
       </w:pPr>
@@ -4482,7 +4443,7 @@
       <w:pPr>
         <w:numPr>
           <w:ilvl w:val="0"/>
-          <w:numId w:val="1022"/>
+          <w:numId w:val="1021"/>
         </w:numPr>
         <w:pStyle w:val="Compact"/>
       </w:pPr>
@@ -4494,7 +4455,7 @@
       <w:pPr>
         <w:numPr>
           <w:ilvl w:val="0"/>
-          <w:numId w:val="1022"/>
+          <w:numId w:val="1021"/>
         </w:numPr>
         <w:pStyle w:val="Compact"/>
       </w:pPr>
@@ -4506,7 +4467,7 @@
       <w:pPr>
         <w:numPr>
           <w:ilvl w:val="0"/>
-          <w:numId w:val="1022"/>
+          <w:numId w:val="1021"/>
         </w:numPr>
         <w:pStyle w:val="Compact"/>
       </w:pPr>
@@ -4530,7 +4491,7 @@
       <w:pPr>
         <w:numPr>
           <w:ilvl w:val="0"/>
-          <w:numId w:val="1023"/>
+          <w:numId w:val="1022"/>
         </w:numPr>
         <w:pStyle w:val="Compact"/>
       </w:pPr>
@@ -4542,7 +4503,7 @@
       <w:pPr>
         <w:numPr>
           <w:ilvl w:val="0"/>
-          <w:numId w:val="1023"/>
+          <w:numId w:val="1022"/>
         </w:numPr>
         <w:pStyle w:val="Compact"/>
       </w:pPr>
@@ -4554,7 +4515,7 @@
       <w:pPr>
         <w:numPr>
           <w:ilvl w:val="0"/>
-          <w:numId w:val="1023"/>
+          <w:numId w:val="1022"/>
         </w:numPr>
         <w:pStyle w:val="Compact"/>
       </w:pPr>
@@ -4562,8 +4523,8 @@
         <w:t xml:space="preserve">依赖：工作流、数据源注册中心、元数据服务、TypeMapper 插件</w:t>
       </w:r>
     </w:p>
-    <w:bookmarkEnd w:id="65"/>
-    <w:bookmarkStart w:id="66" w:name="fullimport"/>
+    <w:bookmarkEnd w:id="56"/>
+    <w:bookmarkStart w:id="57" w:name="fullimport"/>
     <w:p>
       <w:pPr>
         <w:pStyle w:val="Heading4"/>
@@ -4608,7 +4569,7 @@
       <w:pPr>
         <w:numPr>
           <w:ilvl w:val="0"/>
-          <w:numId w:val="1024"/>
+          <w:numId w:val="1023"/>
         </w:numPr>
         <w:pStyle w:val="Compact"/>
       </w:pPr>
@@ -4620,7 +4581,7 @@
       <w:pPr>
         <w:numPr>
           <w:ilvl w:val="0"/>
-          <w:numId w:val="1024"/>
+          <w:numId w:val="1023"/>
         </w:numPr>
         <w:pStyle w:val="Compact"/>
       </w:pPr>
@@ -4632,7 +4593,7 @@
       <w:pPr>
         <w:numPr>
           <w:ilvl w:val="0"/>
-          <w:numId w:val="1024"/>
+          <w:numId w:val="1023"/>
         </w:numPr>
         <w:pStyle w:val="Compact"/>
       </w:pPr>
@@ -4644,7 +4605,7 @@
       <w:pPr>
         <w:numPr>
           <w:ilvl w:val="0"/>
-          <w:numId w:val="1024"/>
+          <w:numId w:val="1023"/>
         </w:numPr>
         <w:pStyle w:val="Compact"/>
       </w:pPr>
@@ -4671,7 +4632,7 @@
       <w:pPr>
         <w:numPr>
           <w:ilvl w:val="0"/>
-          <w:numId w:val="1024"/>
+          <w:numId w:val="1023"/>
         </w:numPr>
         <w:pStyle w:val="Compact"/>
       </w:pPr>
@@ -4695,7 +4656,7 @@
       <w:pPr>
         <w:numPr>
           <w:ilvl w:val="0"/>
-          <w:numId w:val="1025"/>
+          <w:numId w:val="1024"/>
         </w:numPr>
         <w:pStyle w:val="Compact"/>
       </w:pPr>
@@ -4707,7 +4668,7 @@
       <w:pPr>
         <w:numPr>
           <w:ilvl w:val="0"/>
-          <w:numId w:val="1025"/>
+          <w:numId w:val="1024"/>
         </w:numPr>
         <w:pStyle w:val="Compact"/>
       </w:pPr>
@@ -4728,7 +4689,7 @@
       <w:pPr>
         <w:numPr>
           <w:ilvl w:val="0"/>
-          <w:numId w:val="1025"/>
+          <w:numId w:val="1024"/>
         </w:numPr>
         <w:pStyle w:val="Compact"/>
       </w:pPr>
@@ -4736,8 +4697,8 @@
         <w:t xml:space="preserve">依赖：工作流、调度器、SyncWorker、Reader/Writer 插件、元数据与数据源服务</w:t>
       </w:r>
     </w:p>
-    <w:bookmarkEnd w:id="66"/>
-    <w:bookmarkStart w:id="67" w:name="store"/>
+    <w:bookmarkEnd w:id="57"/>
+    <w:bookmarkStart w:id="58" w:name="store"/>
     <w:p>
       <w:pPr>
         <w:pStyle w:val="Heading4"/>
@@ -4782,7 +4743,7 @@
       <w:pPr>
         <w:numPr>
           <w:ilvl w:val="0"/>
-          <w:numId w:val="1026"/>
+          <w:numId w:val="1025"/>
         </w:numPr>
         <w:pStyle w:val="Compact"/>
       </w:pPr>
@@ -4794,7 +4755,7 @@
       <w:pPr>
         <w:numPr>
           <w:ilvl w:val="0"/>
-          <w:numId w:val="1026"/>
+          <w:numId w:val="1025"/>
         </w:numPr>
         <w:pStyle w:val="Compact"/>
       </w:pPr>
@@ -4806,7 +4767,7 @@
       <w:pPr>
         <w:numPr>
           <w:ilvl w:val="0"/>
-          <w:numId w:val="1026"/>
+          <w:numId w:val="1025"/>
         </w:numPr>
         <w:pStyle w:val="Compact"/>
       </w:pPr>
@@ -4833,7 +4794,7 @@
       <w:pPr>
         <w:numPr>
           <w:ilvl w:val="0"/>
-          <w:numId w:val="1026"/>
+          <w:numId w:val="1025"/>
         </w:numPr>
         <w:pStyle w:val="Compact"/>
       </w:pPr>
@@ -4845,7 +4806,7 @@
       <w:pPr>
         <w:numPr>
           <w:ilvl w:val="0"/>
-          <w:numId w:val="1026"/>
+          <w:numId w:val="1025"/>
         </w:numPr>
         <w:pStyle w:val="Compact"/>
       </w:pPr>
@@ -4869,7 +4830,7 @@
       <w:pPr>
         <w:numPr>
           <w:ilvl w:val="0"/>
-          <w:numId w:val="1027"/>
+          <w:numId w:val="1026"/>
         </w:numPr>
         <w:pStyle w:val="Compact"/>
       </w:pPr>
@@ -4890,7 +4851,7 @@
       <w:pPr>
         <w:numPr>
           <w:ilvl w:val="0"/>
-          <w:numId w:val="1027"/>
+          <w:numId w:val="1026"/>
         </w:numPr>
         <w:pStyle w:val="Compact"/>
       </w:pPr>
@@ -4902,7 +4863,7 @@
       <w:pPr>
         <w:numPr>
           <w:ilvl w:val="0"/>
-          <w:numId w:val="1027"/>
+          <w:numId w:val="1026"/>
         </w:numPr>
         <w:pStyle w:val="Compact"/>
       </w:pPr>
@@ -4910,8 +4871,8 @@
         <w:t xml:space="preserve">依赖：工作流、元数据、数据源注册中心、LogAdapter；协作 Supervisor / HA</w:t>
       </w:r>
     </w:p>
-    <w:bookmarkEnd w:id="67"/>
-    <w:bookmarkStart w:id="68" w:name="incrsync"/>
+    <w:bookmarkEnd w:id="58"/>
+    <w:bookmarkStart w:id="59" w:name="incrsync"/>
     <w:p>
       <w:pPr>
         <w:pStyle w:val="Heading4"/>
@@ -4956,7 +4917,7 @@
       <w:pPr>
         <w:numPr>
           <w:ilvl w:val="0"/>
-          <w:numId w:val="1028"/>
+          <w:numId w:val="1027"/>
         </w:numPr>
         <w:pStyle w:val="Compact"/>
       </w:pPr>
@@ -4968,7 +4929,7 @@
       <w:pPr>
         <w:numPr>
           <w:ilvl w:val="0"/>
-          <w:numId w:val="1028"/>
+          <w:numId w:val="1027"/>
         </w:numPr>
         <w:pStyle w:val="Compact"/>
       </w:pPr>
@@ -4980,7 +4941,7 @@
       <w:pPr>
         <w:numPr>
           <w:ilvl w:val="0"/>
-          <w:numId w:val="1028"/>
+          <w:numId w:val="1027"/>
         </w:numPr>
         <w:pStyle w:val="Compact"/>
       </w:pPr>
@@ -4992,7 +4953,7 @@
       <w:pPr>
         <w:numPr>
           <w:ilvl w:val="0"/>
-          <w:numId w:val="1028"/>
+          <w:numId w:val="1027"/>
         </w:numPr>
         <w:pStyle w:val="Compact"/>
       </w:pPr>
@@ -5004,7 +4965,7 @@
       <w:pPr>
         <w:numPr>
           <w:ilvl w:val="0"/>
-          <w:numId w:val="1028"/>
+          <w:numId w:val="1027"/>
         </w:numPr>
         <w:pStyle w:val="Compact"/>
       </w:pPr>
@@ -5028,7 +4989,7 @@
       <w:pPr>
         <w:numPr>
           <w:ilvl w:val="0"/>
-          <w:numId w:val="1029"/>
+          <w:numId w:val="1028"/>
         </w:numPr>
         <w:pStyle w:val="Compact"/>
       </w:pPr>
@@ -5040,7 +5001,7 @@
       <w:pPr>
         <w:numPr>
           <w:ilvl w:val="0"/>
-          <w:numId w:val="1029"/>
+          <w:numId w:val="1028"/>
         </w:numPr>
         <w:pStyle w:val="Compact"/>
       </w:pPr>
@@ -5052,7 +5013,7 @@
       <w:pPr>
         <w:numPr>
           <w:ilvl w:val="0"/>
-          <w:numId w:val="1029"/>
+          <w:numId w:val="1028"/>
         </w:numPr>
         <w:pStyle w:val="Compact"/>
       </w:pPr>
@@ -5060,8 +5021,8 @@
         <w:t xml:space="preserve">依赖：Store、StreamRuntime、元数据；协作 Supervisor / HA</w:t>
       </w:r>
     </w:p>
-    <w:bookmarkEnd w:id="68"/>
-    <w:bookmarkStart w:id="69" w:name="fullverification"/>
+    <w:bookmarkEnd w:id="59"/>
+    <w:bookmarkStart w:id="60" w:name="fullverification"/>
     <w:p>
       <w:pPr>
         <w:pStyle w:val="Heading4"/>
@@ -5106,7 +5067,7 @@
       <w:pPr>
         <w:numPr>
           <w:ilvl w:val="0"/>
-          <w:numId w:val="1030"/>
+          <w:numId w:val="1029"/>
         </w:numPr>
         <w:pStyle w:val="Compact"/>
       </w:pPr>
@@ -5118,7 +5079,7 @@
       <w:pPr>
         <w:numPr>
           <w:ilvl w:val="0"/>
-          <w:numId w:val="1030"/>
+          <w:numId w:val="1029"/>
         </w:numPr>
         <w:pStyle w:val="Compact"/>
       </w:pPr>
@@ -5130,7 +5091,7 @@
       <w:pPr>
         <w:numPr>
           <w:ilvl w:val="0"/>
-          <w:numId w:val="1030"/>
+          <w:numId w:val="1029"/>
         </w:numPr>
         <w:pStyle w:val="Compact"/>
       </w:pPr>
@@ -5142,7 +5103,7 @@
       <w:pPr>
         <w:numPr>
           <w:ilvl w:val="0"/>
-          <w:numId w:val="1030"/>
+          <w:numId w:val="1029"/>
         </w:numPr>
         <w:pStyle w:val="Compact"/>
       </w:pPr>
@@ -5154,7 +5115,7 @@
       <w:pPr>
         <w:numPr>
           <w:ilvl w:val="0"/>
-          <w:numId w:val="1030"/>
+          <w:numId w:val="1029"/>
         </w:numPr>
         <w:pStyle w:val="Compact"/>
       </w:pPr>
@@ -5178,12 +5139,90 @@
       <w:pPr>
         <w:numPr>
           <w:ilvl w:val="0"/>
+          <w:numId w:val="1030"/>
+        </w:numPr>
+        <w:pStyle w:val="Compact"/>
+      </w:pPr>
+      <w:r>
+        <w:t xml:space="preserve">输入：校验表清单、分片大小、延迟阈值</w:t>
+      </w:r>
+    </w:p>
+    <w:p>
+      <w:pPr>
+        <w:numPr>
+          <w:ilvl w:val="0"/>
+          <w:numId w:val="1030"/>
+        </w:numPr>
+        <w:pStyle w:val="Compact"/>
+      </w:pPr>
+      <w:r>
+        <w:t xml:space="preserve">输出：差异报告、订正 SQL、SubTask 状态</w:t>
+      </w:r>
+    </w:p>
+    <w:p>
+      <w:pPr>
+        <w:numPr>
+          <w:ilvl w:val="0"/>
+          <w:numId w:val="1030"/>
+        </w:numPr>
+        <w:pStyle w:val="Compact"/>
+      </w:pPr>
+      <w:r>
+        <w:t xml:space="preserve">依赖：工作流、元数据、数据源注册中心、源/目标库；可选调用 AIEngine 解释差异</w:t>
+      </w:r>
+    </w:p>
+    <w:bookmarkEnd w:id="60"/>
+    <w:bookmarkStart w:id="61" w:name="aiengine"/>
+    <w:p>
+      <w:pPr>
+        <w:pStyle w:val="Heading4"/>
+      </w:pPr>
+      <w:r>
+        <w:t xml:space="preserve">4.2.6 AIEngine</w:t>
+      </w:r>
+    </w:p>
+    <w:p>
+      <w:pPr>
+        <w:pStyle w:val="FirstParagraph"/>
+      </w:pPr>
+      <w:r>
+        <w:rPr>
+          <w:bCs/>
+          <w:b/>
+        </w:rPr>
+        <w:t xml:space="preserve">职责</w:t>
+      </w:r>
+    </w:p>
+    <w:p>
+      <w:pPr>
+        <w:pStyle w:val="BodyText"/>
+      </w:pPr>
+      <w:r>
+        <w:t xml:space="preserve">智能辅助组件，为结构转换与运维决策提供建议，不替代 DBCat / FullImport / Store / IncrSync / FullVerification 等核心执行链路。</w:t>
+      </w:r>
+    </w:p>
+    <w:p>
+      <w:pPr>
+        <w:pStyle w:val="BodyText"/>
+      </w:pPr>
+      <w:r>
+        <w:rPr>
+          <w:bCs/>
+          <w:b/>
+        </w:rPr>
+        <w:t xml:space="preserve">能力要点</w:t>
+      </w:r>
+    </w:p>
+    <w:p>
+      <w:pPr>
+        <w:numPr>
+          <w:ilvl w:val="0"/>
           <w:numId w:val="1031"/>
         </w:numPr>
         <w:pStyle w:val="Compact"/>
       </w:pPr>
       <w:r>
-        <w:t xml:space="preserve">输入：校验表清单、分片大小、延迟阈值</w:t>
+        <w:t xml:space="preserve">基于源/目标元数据给出类型映射与 DDL 改写建议，供 DBCat 确认或人工修订</w:t>
       </w:r>
     </w:p>
     <w:p>
@@ -5195,7 +5234,7 @@
         <w:pStyle w:val="Compact"/>
       </w:pPr>
       <w:r>
-        <w:t xml:space="preserve">输出：差异报告、订正 SQL、SubTask 状态</w:t>
+        <w:t xml:space="preserve">分析任务失败日志、延迟与脏数据特征，输出诊断结论与调参建议</w:t>
       </w:r>
     </w:p>
     <w:p>
@@ -5207,7 +5246,79 @@
         <w:pStyle w:val="Compact"/>
       </w:pPr>
       <w:r>
-        <w:t xml:space="preserve">依赖：工作流、元数据、数据源注册中心、源/目标库</w:t>
+        <w:t xml:space="preserve">对校验差异做归类解释（类型精度、字符集、时钟偏差等）</w:t>
+      </w:r>
+    </w:p>
+    <w:p>
+      <w:pPr>
+        <w:numPr>
+          <w:ilvl w:val="0"/>
+          <w:numId w:val="1031"/>
+        </w:numPr>
+        <w:pStyle w:val="Compact"/>
+      </w:pPr>
+      <w:r>
+        <w:t xml:space="preserve">建议结果可审计、可忽略，默认不自动改写生产配置</w:t>
+      </w:r>
+    </w:p>
+    <w:p>
+      <w:pPr>
+        <w:numPr>
+          <w:ilvl w:val="0"/>
+          <w:numId w:val="1031"/>
+        </w:numPr>
+        <w:pStyle w:val="Compact"/>
+      </w:pPr>
+      <w:r>
+        <w:t xml:space="preserve">由 Supervisor 监控服务健康与调用超时</w:t>
+      </w:r>
+    </w:p>
+    <w:p>
+      <w:pPr>
+        <w:pStyle w:val="FirstParagraph"/>
+      </w:pPr>
+      <w:r>
+        <w:rPr>
+          <w:bCs/>
+          <w:b/>
+        </w:rPr>
+        <w:t xml:space="preserve">对外接口</w:t>
+      </w:r>
+    </w:p>
+    <w:p>
+      <w:pPr>
+        <w:numPr>
+          <w:ilvl w:val="0"/>
+          <w:numId w:val="1032"/>
+        </w:numPr>
+        <w:pStyle w:val="Compact"/>
+      </w:pPr>
+      <w:r>
+        <w:t xml:space="preserve">输入：映射上下文、运行指标摘要、日志片段、差异样本</w:t>
+      </w:r>
+    </w:p>
+    <w:p>
+      <w:pPr>
+        <w:numPr>
+          <w:ilvl w:val="0"/>
+          <w:numId w:val="1032"/>
+        </w:numPr>
+        <w:pStyle w:val="Compact"/>
+      </w:pPr>
+      <w:r>
+        <w:t xml:space="preserve">输出：建议报告（映射方案 / 诊断结论 / 差异解释）</w:t>
+      </w:r>
+    </w:p>
+    <w:p>
+      <w:pPr>
+        <w:numPr>
+          <w:ilvl w:val="0"/>
+          <w:numId w:val="1032"/>
+        </w:numPr>
+        <w:pStyle w:val="Compact"/>
+      </w:pPr>
+      <w:r>
+        <w:t xml:space="preserve">依赖：元数据服务、监控告警；被编排层、DBCat、FullVerification 调用</w:t>
       </w:r>
     </w:p>
     <w:p>
@@ -5217,9 +5328,9 @@
         </w:pict>
       </w:r>
     </w:p>
-    <w:bookmarkEnd w:id="69"/>
-    <w:bookmarkEnd w:id="70"/>
-    <w:bookmarkStart w:id="76" w:name="横切能力"/>
+    <w:bookmarkEnd w:id="61"/>
+    <w:bookmarkEnd w:id="62"/>
+    <w:bookmarkStart w:id="68" w:name="横切能力"/>
     <w:p>
       <w:pPr>
         <w:pStyle w:val="Heading3"/>
@@ -5228,7 +5339,7 @@
         <w:t xml:space="preserve">4.3 横切能力</w:t>
       </w:r>
     </w:p>
-    <w:bookmarkStart w:id="71" w:name="调度器"/>
+    <w:bookmarkStart w:id="63" w:name="调度器"/>
     <w:p>
       <w:pPr>
         <w:pStyle w:val="Heading4"/>
@@ -5273,7 +5384,7 @@
       <w:pPr>
         <w:numPr>
           <w:ilvl w:val="0"/>
-          <w:numId w:val="1032"/>
+          <w:numId w:val="1033"/>
         </w:numPr>
         <w:pStyle w:val="Compact"/>
       </w:pPr>
@@ -5285,7 +5396,7 @@
       <w:pPr>
         <w:numPr>
           <w:ilvl w:val="0"/>
-          <w:numId w:val="1032"/>
+          <w:numId w:val="1033"/>
         </w:numPr>
         <w:pStyle w:val="Compact"/>
       </w:pPr>
@@ -5297,7 +5408,7 @@
       <w:pPr>
         <w:numPr>
           <w:ilvl w:val="0"/>
-          <w:numId w:val="1032"/>
+          <w:numId w:val="1033"/>
         </w:numPr>
         <w:pStyle w:val="Compact"/>
       </w:pPr>
@@ -5309,7 +5420,7 @@
       <w:pPr>
         <w:numPr>
           <w:ilvl w:val="0"/>
-          <w:numId w:val="1032"/>
+          <w:numId w:val="1033"/>
         </w:numPr>
         <w:pStyle w:val="Compact"/>
       </w:pPr>
@@ -5321,7 +5432,7 @@
       <w:pPr>
         <w:numPr>
           <w:ilvl w:val="0"/>
-          <w:numId w:val="1032"/>
+          <w:numId w:val="1033"/>
         </w:numPr>
         <w:pStyle w:val="Compact"/>
       </w:pPr>
@@ -5345,7 +5456,7 @@
       <w:pPr>
         <w:numPr>
           <w:ilvl w:val="0"/>
-          <w:numId w:val="1033"/>
+          <w:numId w:val="1034"/>
         </w:numPr>
         <w:pStyle w:val="Compact"/>
       </w:pPr>
@@ -5357,7 +5468,7 @@
       <w:pPr>
         <w:numPr>
           <w:ilvl w:val="0"/>
-          <w:numId w:val="1033"/>
+          <w:numId w:val="1034"/>
         </w:numPr>
         <w:pStyle w:val="Compact"/>
       </w:pPr>
@@ -5369,7 +5480,7 @@
       <w:pPr>
         <w:numPr>
           <w:ilvl w:val="0"/>
-          <w:numId w:val="1033"/>
+          <w:numId w:val="1034"/>
         </w:numPr>
         <w:pStyle w:val="Compact"/>
       </w:pPr>
@@ -5377,8 +5488,8 @@
         <w:t xml:space="preserve">依赖：资源池、SyncWorker、StreamRuntime、元数据服务</w:t>
       </w:r>
     </w:p>
-    <w:bookmarkEnd w:id="71"/>
-    <w:bookmarkStart w:id="72" w:name="资源池"/>
+    <w:bookmarkEnd w:id="63"/>
+    <w:bookmarkStart w:id="64" w:name="资源池"/>
     <w:p>
       <w:pPr>
         <w:pStyle w:val="Heading4"/>
@@ -5423,7 +5534,7 @@
       <w:pPr>
         <w:numPr>
           <w:ilvl w:val="0"/>
-          <w:numId w:val="1034"/>
+          <w:numId w:val="1035"/>
         </w:numPr>
         <w:pStyle w:val="Compact"/>
       </w:pPr>
@@ -5435,7 +5546,7 @@
       <w:pPr>
         <w:numPr>
           <w:ilvl w:val="0"/>
-          <w:numId w:val="1034"/>
+          <w:numId w:val="1035"/>
         </w:numPr>
         <w:pStyle w:val="Compact"/>
       </w:pPr>
@@ -5447,7 +5558,7 @@
       <w:pPr>
         <w:numPr>
           <w:ilvl w:val="0"/>
-          <w:numId w:val="1034"/>
+          <w:numId w:val="1035"/>
         </w:numPr>
         <w:pStyle w:val="Compact"/>
       </w:pPr>
@@ -5459,7 +5570,7 @@
       <w:pPr>
         <w:numPr>
           <w:ilvl w:val="0"/>
-          <w:numId w:val="1034"/>
+          <w:numId w:val="1035"/>
         </w:numPr>
         <w:pStyle w:val="Compact"/>
       </w:pPr>
@@ -5471,7 +5582,7 @@
       <w:pPr>
         <w:numPr>
           <w:ilvl w:val="0"/>
-          <w:numId w:val="1034"/>
+          <w:numId w:val="1035"/>
         </w:numPr>
         <w:pStyle w:val="Compact"/>
       </w:pPr>
@@ -5495,7 +5606,7 @@
       <w:pPr>
         <w:numPr>
           <w:ilvl w:val="0"/>
-          <w:numId w:val="1035"/>
+          <w:numId w:val="1036"/>
         </w:numPr>
         <w:pStyle w:val="Compact"/>
       </w:pPr>
@@ -5507,7 +5618,7 @@
       <w:pPr>
         <w:numPr>
           <w:ilvl w:val="0"/>
-          <w:numId w:val="1035"/>
+          <w:numId w:val="1036"/>
         </w:numPr>
         <w:pStyle w:val="Compact"/>
       </w:pPr>
@@ -5519,7 +5630,7 @@
       <w:pPr>
         <w:numPr>
           <w:ilvl w:val="0"/>
-          <w:numId w:val="1035"/>
+          <w:numId w:val="1036"/>
         </w:numPr>
         <w:pStyle w:val="Compact"/>
       </w:pPr>
@@ -5527,8 +5638,8 @@
         <w:t xml:space="preserve">依赖：元数据服务、监控告警；被调度器消费</w:t>
       </w:r>
     </w:p>
-    <w:bookmarkEnd w:id="72"/>
-    <w:bookmarkStart w:id="73" w:name="ha-组件"/>
+    <w:bookmarkEnd w:id="64"/>
+    <w:bookmarkStart w:id="65" w:name="ha-组件"/>
     <w:p>
       <w:pPr>
         <w:pStyle w:val="Heading4"/>
@@ -5573,7 +5684,7 @@
       <w:pPr>
         <w:numPr>
           <w:ilvl w:val="0"/>
-          <w:numId w:val="1036"/>
+          <w:numId w:val="1037"/>
         </w:numPr>
         <w:pStyle w:val="Compact"/>
       </w:pPr>
@@ -5585,7 +5696,7 @@
       <w:pPr>
         <w:numPr>
           <w:ilvl w:val="0"/>
-          <w:numId w:val="1036"/>
+          <w:numId w:val="1037"/>
         </w:numPr>
         <w:pStyle w:val="Compact"/>
       </w:pPr>
@@ -5597,7 +5708,7 @@
       <w:pPr>
         <w:numPr>
           <w:ilvl w:val="0"/>
-          <w:numId w:val="1036"/>
+          <w:numId w:val="1037"/>
         </w:numPr>
         <w:pStyle w:val="Compact"/>
       </w:pPr>
@@ -5609,7 +5720,7 @@
       <w:pPr>
         <w:numPr>
           <w:ilvl w:val="0"/>
-          <w:numId w:val="1036"/>
+          <w:numId w:val="1037"/>
         </w:numPr>
         <w:pStyle w:val="Compact"/>
       </w:pPr>
@@ -5621,7 +5732,7 @@
       <w:pPr>
         <w:numPr>
           <w:ilvl w:val="0"/>
-          <w:numId w:val="1036"/>
+          <w:numId w:val="1037"/>
         </w:numPr>
         <w:pStyle w:val="Compact"/>
       </w:pPr>
@@ -5645,7 +5756,7 @@
       <w:pPr>
         <w:numPr>
           <w:ilvl w:val="0"/>
-          <w:numId w:val="1037"/>
+          <w:numId w:val="1038"/>
         </w:numPr>
         <w:pStyle w:val="Compact"/>
       </w:pPr>
@@ -5657,7 +5768,7 @@
       <w:pPr>
         <w:numPr>
           <w:ilvl w:val="0"/>
-          <w:numId w:val="1037"/>
+          <w:numId w:val="1038"/>
         </w:numPr>
         <w:pStyle w:val="Compact"/>
       </w:pPr>
@@ -5669,7 +5780,7 @@
       <w:pPr>
         <w:numPr>
           <w:ilvl w:val="0"/>
-          <w:numId w:val="1037"/>
+          <w:numId w:val="1038"/>
         </w:numPr>
         <w:pStyle w:val="Compact"/>
       </w:pPr>
@@ -5677,8 +5788,8 @@
         <w:t xml:space="preserve">依赖：元数据、协调服务（etcd/ZK）、调度器</w:t>
       </w:r>
     </w:p>
-    <w:bookmarkEnd w:id="73"/>
-    <w:bookmarkStart w:id="74" w:name="监控告警"/>
+    <w:bookmarkEnd w:id="65"/>
+    <w:bookmarkStart w:id="66" w:name="监控告警"/>
     <w:p>
       <w:pPr>
         <w:pStyle w:val="Heading4"/>
@@ -5723,7 +5834,7 @@
       <w:pPr>
         <w:numPr>
           <w:ilvl w:val="0"/>
-          <w:numId w:val="1038"/>
+          <w:numId w:val="1039"/>
         </w:numPr>
         <w:pStyle w:val="Compact"/>
       </w:pPr>
@@ -5735,7 +5846,7 @@
       <w:pPr>
         <w:numPr>
           <w:ilvl w:val="0"/>
-          <w:numId w:val="1038"/>
+          <w:numId w:val="1039"/>
         </w:numPr>
         <w:pStyle w:val="Compact"/>
       </w:pPr>
@@ -5747,7 +5858,7 @@
       <w:pPr>
         <w:numPr>
           <w:ilvl w:val="0"/>
-          <w:numId w:val="1038"/>
+          <w:numId w:val="1039"/>
         </w:numPr>
         <w:pStyle w:val="Compact"/>
       </w:pPr>
@@ -5759,7 +5870,7 @@
       <w:pPr>
         <w:numPr>
           <w:ilvl w:val="0"/>
-          <w:numId w:val="1038"/>
+          <w:numId w:val="1039"/>
         </w:numPr>
         <w:pStyle w:val="Compact"/>
       </w:pPr>
@@ -5771,7 +5882,7 @@
       <w:pPr>
         <w:numPr>
           <w:ilvl w:val="0"/>
-          <w:numId w:val="1038"/>
+          <w:numId w:val="1039"/>
         </w:numPr>
         <w:pStyle w:val="Compact"/>
       </w:pPr>
@@ -5795,7 +5906,7 @@
       <w:pPr>
         <w:numPr>
           <w:ilvl w:val="0"/>
-          <w:numId w:val="1039"/>
+          <w:numId w:val="1040"/>
         </w:numPr>
         <w:pStyle w:val="Compact"/>
       </w:pPr>
@@ -5807,7 +5918,7 @@
       <w:pPr>
         <w:numPr>
           <w:ilvl w:val="0"/>
-          <w:numId w:val="1039"/>
+          <w:numId w:val="1040"/>
         </w:numPr>
         <w:pStyle w:val="Compact"/>
       </w:pPr>
@@ -5819,7 +5930,7 @@
       <w:pPr>
         <w:numPr>
           <w:ilvl w:val="0"/>
-          <w:numId w:val="1039"/>
+          <w:numId w:val="1040"/>
         </w:numPr>
         <w:pStyle w:val="Compact"/>
       </w:pPr>
@@ -5827,8 +5938,8 @@
         <w:t xml:space="preserve">依赖：时序库、AlertManager、控制台；协作编排服务</w:t>
       </w:r>
     </w:p>
-    <w:bookmarkEnd w:id="74"/>
-    <w:bookmarkStart w:id="75" w:name="supervisor"/>
+    <w:bookmarkEnd w:id="66"/>
+    <w:bookmarkStart w:id="67" w:name="supervisor"/>
     <w:p>
       <w:pPr>
         <w:pStyle w:val="Heading4"/>
@@ -5854,7 +5965,7 @@
         <w:pStyle w:val="BodyText"/>
       </w:pPr>
       <w:r>
-        <w:t xml:space="preserve">组件健康监控代理，定时心跳上报，检测 Store / IncrSync 等异常并触发 HA。</w:t>
+        <w:t xml:space="preserve">组件健康监控代理，定时心跳上报，检测 Store / IncrSync / AIEngine 等异常并触发 HA 或告警。</w:t>
       </w:r>
     </w:p>
     <w:p>
@@ -5873,19 +5984,19 @@
       <w:pPr>
         <w:numPr>
           <w:ilvl w:val="0"/>
-          <w:numId w:val="1040"/>
-        </w:numPr>
-        <w:pStyle w:val="Compact"/>
-      </w:pPr>
-      <w:r>
-        <w:t xml:space="preserve">每台 Worker 节点部署，汇报节点与组件存活</w:t>
-      </w:r>
-    </w:p>
-    <w:p>
-      <w:pPr>
-        <w:numPr>
-          <w:ilvl w:val="0"/>
-          <w:numId w:val="1040"/>
+          <w:numId w:val="1041"/>
+        </w:numPr>
+        <w:pStyle w:val="Compact"/>
+      </w:pPr>
+      <w:r>
+        <w:t xml:space="preserve">汇报节点与组件存活</w:t>
+      </w:r>
+    </w:p>
+    <w:p>
+      <w:pPr>
+        <w:numPr>
+          <w:ilvl w:val="0"/>
+          <w:numId w:val="1041"/>
         </w:numPr>
         <w:pStyle w:val="Compact"/>
       </w:pPr>
@@ -5897,7 +6008,7 @@
       <w:pPr>
         <w:numPr>
           <w:ilvl w:val="0"/>
-          <w:numId w:val="1040"/>
+          <w:numId w:val="1041"/>
         </w:numPr>
         <w:pStyle w:val="Compact"/>
       </w:pPr>
@@ -5909,7 +6020,7 @@
       <w:pPr>
         <w:numPr>
           <w:ilvl w:val="0"/>
-          <w:numId w:val="1040"/>
+          <w:numId w:val="1041"/>
         </w:numPr>
         <w:pStyle w:val="Compact"/>
       </w:pPr>
@@ -5921,7 +6032,7 @@
       <w:pPr>
         <w:numPr>
           <w:ilvl w:val="0"/>
-          <w:numId w:val="1040"/>
+          <w:numId w:val="1041"/>
         </w:numPr>
         <w:pStyle w:val="Compact"/>
       </w:pPr>
@@ -5945,7 +6056,7 @@
       <w:pPr>
         <w:numPr>
           <w:ilvl w:val="0"/>
-          <w:numId w:val="1041"/>
+          <w:numId w:val="1042"/>
         </w:numPr>
         <w:pStyle w:val="Compact"/>
       </w:pPr>
@@ -5957,7 +6068,7 @@
       <w:pPr>
         <w:numPr>
           <w:ilvl w:val="0"/>
-          <w:numId w:val="1041"/>
+          <w:numId w:val="1042"/>
         </w:numPr>
         <w:pStyle w:val="Compact"/>
       </w:pPr>
@@ -5969,12 +6080,24 @@
       <w:pPr>
         <w:numPr>
           <w:ilvl w:val="0"/>
-          <w:numId w:val="1041"/>
+          <w:numId w:val="1042"/>
         </w:numPr>
         <w:pStyle w:val="Compact"/>
       </w:pPr>
       <w:r>
         <w:t xml:space="preserve">依赖：元数据、HA 组件、监控告警</w:t>
+      </w:r>
+    </w:p>
+    <w:p>
+      <w:pPr>
+        <w:numPr>
+          <w:ilvl w:val="0"/>
+          <w:numId w:val="1042"/>
+        </w:numPr>
+        <w:pStyle w:val="Compact"/>
+      </w:pPr>
+      <w:r>
+        <w:t xml:space="preserve">监控对象：DBCat、Store、FullImport、IncrSync、FullVerification、AIEngine</w:t>
       </w:r>
     </w:p>
     <w:p>
@@ -5984,9 +6107,9 @@
         </w:pict>
       </w:r>
     </w:p>
-    <w:bookmarkEnd w:id="75"/>
-    <w:bookmarkEnd w:id="76"/>
-    <w:bookmarkStart w:id="81" w:name="运行时与插件"/>
+    <w:bookmarkEnd w:id="67"/>
+    <w:bookmarkEnd w:id="68"/>
+    <w:bookmarkStart w:id="73" w:name="运行时与插件"/>
     <w:p>
       <w:pPr>
         <w:pStyle w:val="Heading3"/>
@@ -5995,7 +6118,7 @@
         <w:t xml:space="preserve">4.4 运行时与插件</w:t>
       </w:r>
     </w:p>
-    <w:bookmarkStart w:id="77" w:name="syncworker"/>
+    <w:bookmarkStart w:id="69" w:name="syncworker"/>
     <w:p>
       <w:pPr>
         <w:pStyle w:val="Heading4"/>
@@ -6040,7 +6163,7 @@
       <w:pPr>
         <w:numPr>
           <w:ilvl w:val="0"/>
-          <w:numId w:val="1042"/>
+          <w:numId w:val="1043"/>
         </w:numPr>
         <w:pStyle w:val="Compact"/>
       </w:pPr>
@@ -6052,7 +6175,7 @@
       <w:pPr>
         <w:numPr>
           <w:ilvl w:val="0"/>
-          <w:numId w:val="1042"/>
+          <w:numId w:val="1043"/>
         </w:numPr>
         <w:pStyle w:val="Compact"/>
       </w:pPr>
@@ -6064,7 +6187,7 @@
       <w:pPr>
         <w:numPr>
           <w:ilvl w:val="0"/>
-          <w:numId w:val="1042"/>
+          <w:numId w:val="1043"/>
         </w:numPr>
         <w:pStyle w:val="Compact"/>
       </w:pPr>
@@ -6076,7 +6199,7 @@
       <w:pPr>
         <w:numPr>
           <w:ilvl w:val="0"/>
-          <w:numId w:val="1042"/>
+          <w:numId w:val="1043"/>
         </w:numPr>
         <w:pStyle w:val="Compact"/>
       </w:pPr>
@@ -6088,7 +6211,7 @@
       <w:pPr>
         <w:numPr>
           <w:ilvl w:val="0"/>
-          <w:numId w:val="1042"/>
+          <w:numId w:val="1043"/>
         </w:numPr>
         <w:pStyle w:val="Compact"/>
       </w:pPr>
@@ -6112,7 +6235,7 @@
       <w:pPr>
         <w:numPr>
           <w:ilvl w:val="0"/>
-          <w:numId w:val="1043"/>
+          <w:numId w:val="1044"/>
         </w:numPr>
         <w:pStyle w:val="Compact"/>
       </w:pPr>
@@ -6124,7 +6247,7 @@
       <w:pPr>
         <w:numPr>
           <w:ilvl w:val="0"/>
-          <w:numId w:val="1043"/>
+          <w:numId w:val="1044"/>
         </w:numPr>
         <w:pStyle w:val="Compact"/>
       </w:pPr>
@@ -6136,7 +6259,7 @@
       <w:pPr>
         <w:numPr>
           <w:ilvl w:val="0"/>
-          <w:numId w:val="1043"/>
+          <w:numId w:val="1044"/>
         </w:numPr>
         <w:pStyle w:val="Compact"/>
       </w:pPr>
@@ -6144,8 +6267,8 @@
         <w:t xml:space="preserve">依赖：调度器、FullImport、Reader/Writer 插件、资源池</w:t>
       </w:r>
     </w:p>
-    <w:bookmarkEnd w:id="77"/>
-    <w:bookmarkStart w:id="78" w:name="streamruntime"/>
+    <w:bookmarkEnd w:id="69"/>
+    <w:bookmarkStart w:id="70" w:name="streamruntime"/>
     <w:p>
       <w:pPr>
         <w:pStyle w:val="Heading4"/>
@@ -6190,7 +6313,7 @@
       <w:pPr>
         <w:numPr>
           <w:ilvl w:val="0"/>
-          <w:numId w:val="1044"/>
+          <w:numId w:val="1045"/>
         </w:numPr>
         <w:pStyle w:val="Compact"/>
       </w:pPr>
@@ -6202,7 +6325,7 @@
       <w:pPr>
         <w:numPr>
           <w:ilvl w:val="0"/>
-          <w:numId w:val="1044"/>
+          <w:numId w:val="1045"/>
         </w:numPr>
         <w:pStyle w:val="Compact"/>
       </w:pPr>
@@ -6214,7 +6337,7 @@
       <w:pPr>
         <w:numPr>
           <w:ilvl w:val="0"/>
-          <w:numId w:val="1044"/>
+          <w:numId w:val="1045"/>
         </w:numPr>
         <w:pStyle w:val="Compact"/>
       </w:pPr>
@@ -6226,7 +6349,7 @@
       <w:pPr>
         <w:numPr>
           <w:ilvl w:val="0"/>
-          <w:numId w:val="1044"/>
+          <w:numId w:val="1045"/>
         </w:numPr>
         <w:pStyle w:val="Compact"/>
       </w:pPr>
@@ -6238,7 +6361,7 @@
       <w:pPr>
         <w:numPr>
           <w:ilvl w:val="0"/>
-          <w:numId w:val="1044"/>
+          <w:numId w:val="1045"/>
         </w:numPr>
         <w:pStyle w:val="Compact"/>
       </w:pPr>
@@ -6262,7 +6385,7 @@
       <w:pPr>
         <w:numPr>
           <w:ilvl w:val="0"/>
-          <w:numId w:val="1045"/>
+          <w:numId w:val="1046"/>
         </w:numPr>
         <w:pStyle w:val="Compact"/>
       </w:pPr>
@@ -6274,7 +6397,7 @@
       <w:pPr>
         <w:numPr>
           <w:ilvl w:val="0"/>
-          <w:numId w:val="1045"/>
+          <w:numId w:val="1046"/>
         </w:numPr>
         <w:pStyle w:val="Compact"/>
       </w:pPr>
@@ -6286,7 +6409,7 @@
       <w:pPr>
         <w:numPr>
           <w:ilvl w:val="0"/>
-          <w:numId w:val="1045"/>
+          <w:numId w:val="1046"/>
         </w:numPr>
         <w:pStyle w:val="Compact"/>
       </w:pPr>
@@ -6294,8 +6417,8 @@
         <w:t xml:space="preserve">依赖：调度器、IncrSync、资源池、元数据服务</w:t>
       </w:r>
     </w:p>
-    <w:bookmarkEnd w:id="78"/>
-    <w:bookmarkStart w:id="79" w:name="readerwriter-插件"/>
+    <w:bookmarkEnd w:id="70"/>
+    <w:bookmarkStart w:id="71" w:name="readerwriter-插件"/>
     <w:p>
       <w:pPr>
         <w:pStyle w:val="Heading4"/>
@@ -6340,7 +6463,7 @@
       <w:pPr>
         <w:numPr>
           <w:ilvl w:val="0"/>
-          <w:numId w:val="1046"/>
+          <w:numId w:val="1047"/>
         </w:numPr>
         <w:pStyle w:val="Compact"/>
       </w:pPr>
@@ -6352,7 +6475,7 @@
       <w:pPr>
         <w:numPr>
           <w:ilvl w:val="0"/>
-          <w:numId w:val="1046"/>
+          <w:numId w:val="1047"/>
         </w:numPr>
         <w:pStyle w:val="Compact"/>
       </w:pPr>
@@ -6373,7 +6496,7 @@
       <w:pPr>
         <w:numPr>
           <w:ilvl w:val="0"/>
-          <w:numId w:val="1046"/>
+          <w:numId w:val="1047"/>
         </w:numPr>
         <w:pStyle w:val="Compact"/>
       </w:pPr>
@@ -6385,7 +6508,7 @@
       <w:pPr>
         <w:numPr>
           <w:ilvl w:val="0"/>
-          <w:numId w:val="1046"/>
+          <w:numId w:val="1047"/>
         </w:numPr>
         <w:pStyle w:val="Compact"/>
       </w:pPr>
@@ -6397,7 +6520,7 @@
       <w:pPr>
         <w:numPr>
           <w:ilvl w:val="0"/>
-          <w:numId w:val="1046"/>
+          <w:numId w:val="1047"/>
         </w:numPr>
         <w:pStyle w:val="Compact"/>
       </w:pPr>
@@ -6421,7 +6544,7 @@
       <w:pPr>
         <w:numPr>
           <w:ilvl w:val="0"/>
-          <w:numId w:val="1047"/>
+          <w:numId w:val="1048"/>
         </w:numPr>
         <w:pStyle w:val="Compact"/>
       </w:pPr>
@@ -6433,7 +6556,7 @@
       <w:pPr>
         <w:numPr>
           <w:ilvl w:val="0"/>
-          <w:numId w:val="1047"/>
+          <w:numId w:val="1048"/>
         </w:numPr>
         <w:pStyle w:val="Compact"/>
       </w:pPr>
@@ -6445,7 +6568,7 @@
       <w:pPr>
         <w:numPr>
           <w:ilvl w:val="0"/>
-          <w:numId w:val="1047"/>
+          <w:numId w:val="1048"/>
         </w:numPr>
         <w:pStyle w:val="Compact"/>
       </w:pPr>
@@ -6453,8 +6576,8 @@
         <w:t xml:space="preserve">依赖：FullImport、SyncWorker、数据源注册中心、插件注册中心</w:t>
       </w:r>
     </w:p>
-    <w:bookmarkEnd w:id="79"/>
-    <w:bookmarkStart w:id="80" w:name="logadapter-插件"/>
+    <w:bookmarkEnd w:id="71"/>
+    <w:bookmarkStart w:id="72" w:name="logadapter-插件"/>
     <w:p>
       <w:pPr>
         <w:pStyle w:val="Heading4"/>
@@ -6499,7 +6622,7 @@
       <w:pPr>
         <w:numPr>
           <w:ilvl w:val="0"/>
-          <w:numId w:val="1048"/>
+          <w:numId w:val="1049"/>
         </w:numPr>
         <w:pStyle w:val="Compact"/>
       </w:pPr>
@@ -6511,7 +6634,7 @@
       <w:pPr>
         <w:numPr>
           <w:ilvl w:val="0"/>
-          <w:numId w:val="1048"/>
+          <w:numId w:val="1049"/>
         </w:numPr>
         <w:pStyle w:val="Compact"/>
       </w:pPr>
@@ -6523,7 +6646,7 @@
       <w:pPr>
         <w:numPr>
           <w:ilvl w:val="0"/>
-          <w:numId w:val="1048"/>
+          <w:numId w:val="1049"/>
         </w:numPr>
         <w:pStyle w:val="Compact"/>
       </w:pPr>
@@ -6535,7 +6658,7 @@
       <w:pPr>
         <w:numPr>
           <w:ilvl w:val="0"/>
-          <w:numId w:val="1048"/>
+          <w:numId w:val="1049"/>
         </w:numPr>
         <w:pStyle w:val="Compact"/>
       </w:pPr>
@@ -6547,7 +6670,7 @@
       <w:pPr>
         <w:numPr>
           <w:ilvl w:val="0"/>
-          <w:numId w:val="1048"/>
+          <w:numId w:val="1049"/>
         </w:numPr>
         <w:pStyle w:val="Compact"/>
       </w:pPr>
@@ -6571,7 +6694,7 @@
       <w:pPr>
         <w:numPr>
           <w:ilvl w:val="0"/>
-          <w:numId w:val="1049"/>
+          <w:numId w:val="1050"/>
         </w:numPr>
         <w:pStyle w:val="Compact"/>
       </w:pPr>
@@ -6583,7 +6706,7 @@
       <w:pPr>
         <w:numPr>
           <w:ilvl w:val="0"/>
-          <w:numId w:val="1049"/>
+          <w:numId w:val="1050"/>
         </w:numPr>
         <w:pStyle w:val="Compact"/>
       </w:pPr>
@@ -6595,7 +6718,7 @@
       <w:pPr>
         <w:numPr>
           <w:ilvl w:val="0"/>
-          <w:numId w:val="1049"/>
+          <w:numId w:val="1050"/>
         </w:numPr>
         <w:pStyle w:val="Compact"/>
       </w:pPr>
@@ -6610,10 +6733,10 @@
         </w:pict>
       </w:r>
     </w:p>
-    <w:bookmarkEnd w:id="80"/>
-    <w:bookmarkEnd w:id="81"/>
-    <w:bookmarkEnd w:id="82"/>
-    <w:bookmarkStart w:id="106" w:name="流程设计"/>
+    <w:bookmarkEnd w:id="72"/>
+    <w:bookmarkEnd w:id="73"/>
+    <w:bookmarkEnd w:id="74"/>
+    <w:bookmarkStart w:id="98" w:name="流程设计"/>
     <w:p>
       <w:pPr>
         <w:pStyle w:val="Heading2"/>
@@ -6622,7 +6745,7 @@
         <w:t xml:space="preserve">5. 流程设计</w:t>
       </w:r>
     </w:p>
-    <w:bookmarkStart w:id="86" w:name="迁移业务流程概述"/>
+    <w:bookmarkStart w:id="78" w:name="迁移业务流程概述"/>
     <w:p>
       <w:pPr>
         <w:pStyle w:val="Heading3"/>
@@ -6640,18 +6763,18 @@
           <wp:inline>
             <wp:extent cx="5334000" cy="12375767"/>
             <wp:effectExtent b="0" l="0" r="0" t="0"/>
-            <wp:docPr descr="图5-1 标准迁移流程图" title="" id="84" name="Picture"/>
+            <wp:docPr descr="图5-1 标准迁移流程图" title="" id="76" name="Picture"/>
             <a:graphic>
               <a:graphicData uri="http://schemas.openxmlformats.org/drawingml/2006/picture">
                 <pic:pic>
                   <pic:nvPicPr>
-                    <pic:cNvPr descr="images/fig5-1-migration-flow.png" id="85" name="Picture"/>
+                    <pic:cNvPr descr="images/fig5-1-migration-flow.png" id="77" name="Picture"/>
                     <pic:cNvPicPr>
                       <a:picLocks noChangeArrowheads="1" noChangeAspect="1"/>
                     </pic:cNvPicPr>
                   </pic:nvPicPr>
                   <pic:blipFill>
-                    <a:blip r:embed="rId83"/>
+                    <a:blip r:embed="rId75"/>
                     <a:stretch>
                       <a:fillRect/>
                     </a:stretch>
@@ -6738,7 +6861,7 @@
       <w:pPr>
         <w:numPr>
           <w:ilvl w:val="0"/>
-          <w:numId w:val="1050"/>
+          <w:numId w:val="1051"/>
         </w:numPr>
         <w:pStyle w:val="Compact"/>
       </w:pPr>
@@ -6757,7 +6880,7 @@
       <w:pPr>
         <w:numPr>
           <w:ilvl w:val="0"/>
-          <w:numId w:val="1050"/>
+          <w:numId w:val="1051"/>
         </w:numPr>
         <w:pStyle w:val="Compact"/>
       </w:pPr>
@@ -6788,7 +6911,7 @@
       <w:pPr>
         <w:numPr>
           <w:ilvl w:val="0"/>
-          <w:numId w:val="1051"/>
+          <w:numId w:val="1052"/>
         </w:numPr>
         <w:pStyle w:val="Compact"/>
       </w:pPr>
@@ -6800,14 +6923,14 @@
         <w:t xml:space="preserve">结构迁移（DBCat）</w:t>
       </w:r>
       <w:r>
-        <w:t xml:space="preserve">：完成 Schema 转换并在目标端落地对象，写入映射版本。</w:t>
-      </w:r>
-    </w:p>
-    <w:p>
-      <w:pPr>
-        <w:numPr>
-          <w:ilvl w:val="0"/>
-          <w:numId w:val="1051"/>
+        <w:t xml:space="preserve">：完成 Schema 转换并在目标端落地对象，写入映射版本；可选调用 AIEngine 生成映射建议。</w:t>
+      </w:r>
+    </w:p>
+    <w:p>
+      <w:pPr>
+        <w:numPr>
+          <w:ilvl w:val="0"/>
+          <w:numId w:val="1052"/>
         </w:numPr>
         <w:pStyle w:val="Compact"/>
       </w:pPr>
@@ -6826,7 +6949,7 @@
       <w:pPr>
         <w:numPr>
           <w:ilvl w:val="0"/>
-          <w:numId w:val="1051"/>
+          <w:numId w:val="1052"/>
         </w:numPr>
         <w:pStyle w:val="Compact"/>
       </w:pPr>
@@ -6857,7 +6980,7 @@
       <w:pPr>
         <w:numPr>
           <w:ilvl w:val="0"/>
-          <w:numId w:val="1052"/>
+          <w:numId w:val="1053"/>
         </w:numPr>
         <w:pStyle w:val="Compact"/>
       </w:pPr>
@@ -6869,14 +6992,14 @@
         <w:t xml:space="preserve">数据校验（FullVerification）</w:t>
       </w:r>
       <w:r>
-        <w:t xml:space="preserve">：延迟达标后对比源/目标；有差异则订正后复检。</w:t>
-      </w:r>
-    </w:p>
-    <w:p>
-      <w:pPr>
-        <w:numPr>
-          <w:ilvl w:val="0"/>
-          <w:numId w:val="1052"/>
+        <w:t xml:space="preserve">：延迟达标后对比源/目标；有差异则订正后复检，可选由 AIEngine 解释差异原因。</w:t>
+      </w:r>
+    </w:p>
+    <w:p>
+      <w:pPr>
+        <w:numPr>
+          <w:ilvl w:val="0"/>
+          <w:numId w:val="1053"/>
         </w:numPr>
         <w:pStyle w:val="Compact"/>
       </w:pPr>
@@ -6895,7 +7018,7 @@
       <w:pPr>
         <w:numPr>
           <w:ilvl w:val="0"/>
-          <w:numId w:val="1052"/>
+          <w:numId w:val="1053"/>
         </w:numPr>
         <w:pStyle w:val="Compact"/>
       </w:pPr>
@@ -6910,8 +7033,8 @@
         <w:t xml:space="preserve">：任务归档。</w:t>
       </w:r>
     </w:p>
-    <w:bookmarkEnd w:id="86"/>
-    <w:bookmarkStart w:id="87" w:name="流程设计说明"/>
+    <w:bookmarkEnd w:id="78"/>
+    <w:bookmarkStart w:id="79" w:name="流程设计说明"/>
     <w:p>
       <w:pPr>
         <w:pStyle w:val="Heading3"/>
@@ -6943,7 +7066,7 @@
         <w:t xml:space="preserve"> </w:t>
       </w:r>
       <w:r>
-        <w:t xml:space="preserve">目标端需要先具备与源端语义对齐的表、索引与约束，全量 Writer 与增量应用才有承载对象。若跳过结构直接写数，将出现建表失败、类型不兼容或约束冲突。结构阶段还将映射结果版本化写入元数据，供后续阶段按统一对象名与类型语义执行。</w:t>
+        <w:t xml:space="preserve">目标端需要先具备与源端语义对齐的表、索引与约束，全量 Writer 与增量应用才有承载对象。若跳过结构直接写数，将出现建表失败、类型不兼容或约束冲突。结构阶段还将映射结果版本化写入元数据，供后续阶段按统一对象名与类型语义执行。复杂异构映射可先由 AIEngine 给出建议，经确认后再由 DBCat 执行。</w:t>
       </w:r>
     </w:p>
     <w:p>
@@ -7024,7 +7147,7 @@
         <w:t xml:space="preserve"> </w:t>
       </w:r>
       <w:r>
-        <w:t xml:space="preserve">结构、全量、增量完成后，需在切换前用 FullVerification 验证一致性。校验启动前要求增量延迟低于阈值，避免追平过程中的假差异。发现差异进入订正与复检回路，未通过则阻塞切换。</w:t>
+        <w:t xml:space="preserve">结构、全量、增量完成后，需在切换前用 FullVerification 验证一致性。校验启动前要求增量延迟低于阈值，避免追平过程中的假差异。发现差异进入订正与复检回路，未通过则阻塞切换；AIEngine 可对差异样本做归类解释，辅助人工订正。</w:t>
       </w:r>
     </w:p>
     <w:p>
@@ -7060,8 +7183,8 @@
         <w:t xml:space="preserve">先有可写容器（结构），再有存量基线（全量），再补运行期变更（增量），再独立验真（校验），最后切流量（切换）。</w:t>
       </w:r>
     </w:p>
-    <w:bookmarkEnd w:id="87"/>
-    <w:bookmarkStart w:id="91" w:name="任务状态机"/>
+    <w:bookmarkEnd w:id="79"/>
+    <w:bookmarkStart w:id="83" w:name="任务状态机"/>
     <w:p>
       <w:pPr>
         <w:pStyle w:val="Heading3"/>
@@ -7079,18 +7202,18 @@
           <wp:inline>
             <wp:extent cx="4343400" cy="11023600"/>
             <wp:effectExtent b="0" l="0" r="0" t="0"/>
-            <wp:docPr descr="图5-2 迁移任务状态机" title="" id="89" name="Picture"/>
+            <wp:docPr descr="图5-2 迁移任务状态机" title="" id="81" name="Picture"/>
             <a:graphic>
               <a:graphicData uri="http://schemas.openxmlformats.org/drawingml/2006/picture">
                 <pic:pic>
                   <pic:nvPicPr>
-                    <pic:cNvPr descr="images/fig5-2-state-machine.png" id="90" name="Picture"/>
+                    <pic:cNvPr descr="images/fig5-2-state-machine.png" id="82" name="Picture"/>
                     <pic:cNvPicPr>
                       <a:picLocks noChangeArrowheads="1" noChangeAspect="1"/>
                     </pic:cNvPicPr>
                   </pic:nvPicPr>
                   <pic:blipFill>
-                    <a:blip r:embed="rId88"/>
+                    <a:blip r:embed="rId80"/>
                     <a:stretch>
                       <a:fillRect/>
                     </a:stretch>
@@ -7300,8 +7423,8 @@
         <w:t xml:space="preserve">；多轮复检通过后方可切换。</w:t>
       </w:r>
     </w:p>
-    <w:bookmarkEnd w:id="91"/>
-    <w:bookmarkStart w:id="92" w:name="阶段衔接设计"/>
+    <w:bookmarkEnd w:id="83"/>
+    <w:bookmarkStart w:id="84" w:name="阶段衔接设计"/>
     <w:p>
       <w:pPr>
         <w:pStyle w:val="Heading3"/>
@@ -7691,8 +7814,8 @@
         <w:t xml:space="preserve">：允许进入校验的最大增量延迟。阈值过低会频繁阻塞校验，过高则增加假差异；建议按业务 RPO 与表规模调参，并在大表场景适当放宽后配合复检。</w:t>
       </w:r>
     </w:p>
-    <w:bookmarkEnd w:id="92"/>
-    <w:bookmarkStart w:id="93" w:name="并行与串行策略"/>
+    <w:bookmarkEnd w:id="84"/>
+    <w:bookmarkStart w:id="85" w:name="并行与串行策略"/>
     <w:p>
       <w:pPr>
         <w:pStyle w:val="Heading3"/>
@@ -7964,8 +8087,8 @@
         <w:t xml:space="preserve">工作流按策略拆分 SubTask：全量/校验为每表生成可并行子任务；增量仅创建一个 IncrSync 子任务。</w:t>
       </w:r>
     </w:p>
-    <w:bookmarkEnd w:id="93"/>
-    <w:bookmarkStart w:id="101" w:name="核心数据流"/>
+    <w:bookmarkEnd w:id="85"/>
+    <w:bookmarkStart w:id="93" w:name="核心数据流"/>
     <w:p>
       <w:pPr>
         <w:pStyle w:val="Heading3"/>
@@ -7983,18 +8106,18 @@
           <wp:inline>
             <wp:extent cx="5334000" cy="2038790"/>
             <wp:effectExtent b="0" l="0" r="0" t="0"/>
-            <wp:docPr descr="图5-3 核心数据流图" title="" id="95" name="Picture"/>
+            <wp:docPr descr="图5-3 核心数据流图" title="" id="87" name="Picture"/>
             <a:graphic>
               <a:graphicData uri="http://schemas.openxmlformats.org/drawingml/2006/picture">
                 <pic:pic>
                   <pic:nvPicPr>
-                    <pic:cNvPr descr="images/fig5-3-data-flow.png" id="96" name="Picture"/>
+                    <pic:cNvPr descr="images/fig5-3-data-flow.png" id="88" name="Picture"/>
                     <pic:cNvPicPr>
                       <a:picLocks noChangeArrowheads="1" noChangeAspect="1"/>
                     </pic:cNvPicPr>
                   </pic:nvPicPr>
                   <pic:blipFill>
-                    <a:blip r:embed="rId94"/>
+                    <a:blip r:embed="rId86"/>
                     <a:stretch>
                       <a:fillRect/>
                     </a:stretch>
@@ -8217,7 +8340,7 @@
         </w:tc>
       </w:tr>
     </w:tbl>
-    <w:bookmarkStart w:id="97" w:name="结构迁移数据流"/>
+    <w:bookmarkStart w:id="89" w:name="结构迁移数据流"/>
     <w:p>
       <w:pPr>
         <w:pStyle w:val="Heading4"/>
@@ -8234,8 +8357,8 @@
         <w:t xml:space="preserve">源端 Schema 采集 → 方言语法解析 → TypeMapper 类型映射 → 目标端 DDL 按拓扑序执行 → 映射元数据与 mapping version 写入元数据服务。</w:t>
       </w:r>
     </w:p>
-    <w:bookmarkEnd w:id="97"/>
-    <w:bookmarkStart w:id="98" w:name="全量迁移数据流"/>
+    <w:bookmarkEnd w:id="89"/>
+    <w:bookmarkStart w:id="90" w:name="全量迁移数据流"/>
     <w:p>
       <w:pPr>
         <w:pStyle w:val="Heading4"/>
@@ -8264,8 +8387,8 @@
         <w:t xml:space="preserve">。</w:t>
       </w:r>
     </w:p>
-    <w:bookmarkEnd w:id="98"/>
-    <w:bookmarkStart w:id="99" w:name="增量同步数据流"/>
+    <w:bookmarkEnd w:id="90"/>
+    <w:bookmarkStart w:id="91" w:name="增量同步数据流"/>
     <w:p>
       <w:pPr>
         <w:pStyle w:val="Heading4"/>
@@ -8282,8 +8405,8 @@
         <w:t xml:space="preserve">变更日志经 LogAdapter 由 Store 拉取解析为 DML/DDL/HB → 进入 Record 队列 → IncrSync 应用至目标库；StreamRuntime Checkpoint 持久化消费位点。</w:t>
       </w:r>
     </w:p>
-    <w:bookmarkEnd w:id="99"/>
-    <w:bookmarkStart w:id="100" w:name="数据校验数据流"/>
+    <w:bookmarkEnd w:id="91"/>
+    <w:bookmarkStart w:id="92" w:name="数据校验数据流"/>
     <w:p>
       <w:pPr>
         <w:pStyle w:val="Heading4"/>
@@ -8300,9 +8423,9 @@
         <w:t xml:space="preserve">按主键/索引切片 → 源/目标流式读取 → 类型格式化对比 → 输出差异报告与订正 SQL → 可选进入订正复检循环。</w:t>
       </w:r>
     </w:p>
-    <w:bookmarkEnd w:id="100"/>
-    <w:bookmarkEnd w:id="101"/>
-    <w:bookmarkStart w:id="105" w:name="端到端时序"/>
+    <w:bookmarkEnd w:id="92"/>
+    <w:bookmarkEnd w:id="93"/>
+    <w:bookmarkStart w:id="97" w:name="端到端时序"/>
     <w:p>
       <w:pPr>
         <w:pStyle w:val="Heading3"/>
@@ -8320,18 +8443,18 @@
           <wp:inline>
             <wp:extent cx="5334000" cy="3530417"/>
             <wp:effectExtent b="0" l="0" r="0" t="0"/>
-            <wp:docPr descr="图5-4 端到端迁移时序图" title="" id="103" name="Picture"/>
+            <wp:docPr descr="图5-4 端到端迁移时序图" title="" id="95" name="Picture"/>
             <a:graphic>
               <a:graphicData uri="http://schemas.openxmlformats.org/drawingml/2006/picture">
                 <pic:pic>
                   <pic:nvPicPr>
-                    <pic:cNvPr descr="images/fig5-4-sequence.png" id="104" name="Picture"/>
+                    <pic:cNvPr descr="images/fig5-4-sequence.png" id="96" name="Picture"/>
                     <pic:cNvPicPr>
                       <a:picLocks noChangeArrowheads="1" noChangeAspect="1"/>
                     </pic:cNvPicPr>
                   </pic:nvPicPr>
                   <pic:blipFill>
-                    <a:blip r:embed="rId102"/>
+                    <a:blip r:embed="rId94"/>
                     <a:stretch>
                       <a:fillRect/>
                     </a:stretch>
@@ -8390,7 +8513,7 @@
       <w:pPr>
         <w:numPr>
           <w:ilvl w:val="0"/>
-          <w:numId w:val="1053"/>
+          <w:numId w:val="1054"/>
         </w:numPr>
         <w:pStyle w:val="Compact"/>
       </w:pPr>
@@ -8409,7 +8532,7 @@
       <w:pPr>
         <w:numPr>
           <w:ilvl w:val="0"/>
-          <w:numId w:val="1053"/>
+          <w:numId w:val="1054"/>
         </w:numPr>
         <w:pStyle w:val="Compact"/>
       </w:pPr>
@@ -8428,7 +8551,7 @@
       <w:pPr>
         <w:numPr>
           <w:ilvl w:val="0"/>
-          <w:numId w:val="1053"/>
+          <w:numId w:val="1054"/>
         </w:numPr>
         <w:pStyle w:val="Compact"/>
       </w:pPr>
@@ -8458,9 +8581,9 @@
         </w:pict>
       </w:r>
     </w:p>
-    <w:bookmarkEnd w:id="105"/>
-    <w:bookmarkEnd w:id="106"/>
-    <w:bookmarkStart w:id="112" w:name="数据与接口设计"/>
+    <w:bookmarkEnd w:id="97"/>
+    <w:bookmarkEnd w:id="98"/>
+    <w:bookmarkStart w:id="104" w:name="数据与接口设计"/>
     <w:p>
       <w:pPr>
         <w:pStyle w:val="Heading2"/>
@@ -8469,7 +8592,7 @@
         <w:t xml:space="preserve">6. 数据与接口设计</w:t>
       </w:r>
     </w:p>
-    <w:bookmarkStart w:id="107" w:name="核心数据模型"/>
+    <w:bookmarkStart w:id="99" w:name="核心数据模型"/>
     <w:p>
       <w:pPr>
         <w:pStyle w:val="Heading3"/>
@@ -8912,8 +9035,8 @@
         </w:tc>
       </w:tr>
     </w:tbl>
-    <w:bookmarkEnd w:id="107"/>
-    <w:bookmarkStart w:id="108" w:name="插件能力矩阵"/>
+    <w:bookmarkEnd w:id="99"/>
+    <w:bookmarkStart w:id="100" w:name="插件能力矩阵"/>
     <w:p>
       <w:pPr>
         <w:pStyle w:val="Heading3"/>
@@ -9444,8 +9567,8 @@
         <w:t xml:space="preserve">✅ 已支持 / 🔲 规划中 / — 不适用</w:t>
       </w:r>
     </w:p>
-    <w:bookmarkEnd w:id="108"/>
-    <w:bookmarkStart w:id="109" w:name="插件注册机制"/>
+    <w:bookmarkEnd w:id="100"/>
+    <w:bookmarkStart w:id="101" w:name="插件注册机制"/>
     <w:p>
       <w:pPr>
         <w:pStyle w:val="Heading3"/>
@@ -9500,8 +9623,8 @@
         <w:t xml:space="preserve">流程：插件包提交 → 注册中心登记 → 兼容性校验 → 写入插件目录 → 运行时 ClassLoader 隔离加载 → 执行引擎按名称引用。LogAdapter 另通过 SPI 描述文件注册 Factory。</w:t>
       </w:r>
     </w:p>
-    <w:bookmarkEnd w:id="109"/>
-    <w:bookmarkStart w:id="110" w:name="对外接口概要"/>
+    <w:bookmarkEnd w:id="101"/>
+    <w:bookmarkStart w:id="102" w:name="对外接口概要"/>
     <w:p>
       <w:pPr>
         <w:pStyle w:val="Heading3"/>
@@ -9818,8 +9941,8 @@
         <w:t xml:space="preserve">详细请求/响应 Schema 另见《迁移平台 API 接口规范》。</w:t>
       </w:r>
     </w:p>
-    <w:bookmarkEnd w:id="110"/>
-    <w:bookmarkStart w:id="111" w:name="内部接口原则"/>
+    <w:bookmarkEnd w:id="102"/>
+    <w:bookmarkStart w:id="103" w:name="内部接口原则"/>
     <w:p>
       <w:pPr>
         <w:pStyle w:val="Heading3"/>
@@ -9832,7 +9955,7 @@
       <w:pPr>
         <w:numPr>
           <w:ilvl w:val="0"/>
-          <w:numId w:val="1054"/>
+          <w:numId w:val="1055"/>
         </w:numPr>
         <w:pStyle w:val="Compact"/>
       </w:pPr>
@@ -9844,7 +9967,7 @@
       <w:pPr>
         <w:numPr>
           <w:ilvl w:val="0"/>
-          <w:numId w:val="1054"/>
+          <w:numId w:val="1055"/>
         </w:numPr>
         <w:pStyle w:val="Compact"/>
       </w:pPr>
@@ -9856,7 +9979,7 @@
       <w:pPr>
         <w:numPr>
           <w:ilvl w:val="0"/>
-          <w:numId w:val="1054"/>
+          <w:numId w:val="1055"/>
         </w:numPr>
         <w:pStyle w:val="Compact"/>
       </w:pPr>
@@ -9883,7 +10006,7 @@
       <w:pPr>
         <w:numPr>
           <w:ilvl w:val="0"/>
-          <w:numId w:val="1054"/>
+          <w:numId w:val="1055"/>
         </w:numPr>
         <w:pStyle w:val="Compact"/>
       </w:pPr>
@@ -9898,9 +10021,9 @@
         </w:pict>
       </w:r>
     </w:p>
-    <w:bookmarkEnd w:id="111"/>
-    <w:bookmarkEnd w:id="112"/>
-    <w:bookmarkStart w:id="116" w:name="调度与资源管理"/>
+    <w:bookmarkEnd w:id="103"/>
+    <w:bookmarkEnd w:id="104"/>
+    <w:bookmarkStart w:id="108" w:name="调度与资源管理"/>
     <w:p>
       <w:pPr>
         <w:pStyle w:val="Heading2"/>
@@ -9909,7 +10032,7 @@
         <w:t xml:space="preserve">7. 调度与资源管理</w:t>
       </w:r>
     </w:p>
-    <w:bookmarkStart w:id="113" w:name="调度架构"/>
+    <w:bookmarkStart w:id="105" w:name="调度架构"/>
     <w:p>
       <w:pPr>
         <w:pStyle w:val="Heading3"/>
@@ -9926,8 +10049,8 @@
         <w:t xml:space="preserve">调度链路为：编排服务 / 工作流 → 调度器 → 资源池 → Worker 节点池（SyncWorker / StreamWorker）。调度器是控制平面与数据平面的衔接枢纽：上游接收作业规格，下游落实到具体进程与 Slot，并向元数据回写作业生命周期状态。</w:t>
       </w:r>
     </w:p>
-    <w:bookmarkEnd w:id="113"/>
-    <w:bookmarkStart w:id="114" w:name="调度策略"/>
+    <w:bookmarkEnd w:id="105"/>
+    <w:bookmarkStart w:id="106" w:name="调度策略"/>
     <w:p>
       <w:pPr>
         <w:pStyle w:val="Heading3"/>
@@ -10081,8 +10204,8 @@
         </w:tc>
       </w:tr>
     </w:tbl>
-    <w:bookmarkEnd w:id="114"/>
-    <w:bookmarkStart w:id="115" w:name="资源与作业映射"/>
+    <w:bookmarkEnd w:id="106"/>
+    <w:bookmarkStart w:id="107" w:name="资源与作业映射"/>
     <w:p>
       <w:pPr>
         <w:pStyle w:val="Heading3"/>
@@ -10274,9 +10397,9 @@
         </w:pict>
       </w:r>
     </w:p>
-    <w:bookmarkEnd w:id="115"/>
-    <w:bookmarkEnd w:id="116"/>
-    <w:bookmarkStart w:id="122" w:name="非功能设计"/>
+    <w:bookmarkEnd w:id="107"/>
+    <w:bookmarkEnd w:id="108"/>
+    <w:bookmarkStart w:id="114" w:name="非功能设计"/>
     <w:p>
       <w:pPr>
         <w:pStyle w:val="Heading2"/>
@@ -10285,7 +10408,7 @@
         <w:t xml:space="preserve">8. 非功能设计</w:t>
       </w:r>
     </w:p>
-    <w:bookmarkStart w:id="117" w:name="容错"/>
+    <w:bookmarkStart w:id="109" w:name="容错"/>
     <w:p>
       <w:pPr>
         <w:pStyle w:val="Heading3"/>
@@ -10500,8 +10623,8 @@
         </w:tc>
       </w:tr>
     </w:tbl>
-    <w:bookmarkEnd w:id="117"/>
-    <w:bookmarkStart w:id="118" w:name="安全"/>
+    <w:bookmarkEnd w:id="109"/>
+    <w:bookmarkStart w:id="110" w:name="安全"/>
     <w:p>
       <w:pPr>
         <w:pStyle w:val="Heading3"/>
@@ -10514,7 +10637,7 @@
       <w:pPr>
         <w:numPr>
           <w:ilvl w:val="0"/>
-          <w:numId w:val="1055"/>
+          <w:numId w:val="1056"/>
         </w:numPr>
         <w:pStyle w:val="Compact"/>
       </w:pPr>
@@ -10526,7 +10649,7 @@
       <w:pPr>
         <w:numPr>
           <w:ilvl w:val="0"/>
-          <w:numId w:val="1055"/>
+          <w:numId w:val="1056"/>
         </w:numPr>
         <w:pStyle w:val="Compact"/>
       </w:pPr>
@@ -10538,7 +10661,7 @@
       <w:pPr>
         <w:numPr>
           <w:ilvl w:val="0"/>
-          <w:numId w:val="1055"/>
+          <w:numId w:val="1056"/>
         </w:numPr>
         <w:pStyle w:val="Compact"/>
       </w:pPr>
@@ -10550,7 +10673,7 @@
       <w:pPr>
         <w:numPr>
           <w:ilvl w:val="0"/>
-          <w:numId w:val="1055"/>
+          <w:numId w:val="1056"/>
         </w:numPr>
         <w:pStyle w:val="Compact"/>
       </w:pPr>
@@ -10562,7 +10685,7 @@
       <w:pPr>
         <w:numPr>
           <w:ilvl w:val="0"/>
-          <w:numId w:val="1055"/>
+          <w:numId w:val="1056"/>
         </w:numPr>
         <w:pStyle w:val="Compact"/>
       </w:pPr>
@@ -10570,8 +10693,8 @@
         <w:t xml:space="preserve">鉴权失败默认拒绝（fail-close）</w:t>
       </w:r>
     </w:p>
-    <w:bookmarkEnd w:id="118"/>
-    <w:bookmarkStart w:id="119" w:name="性能"/>
+    <w:bookmarkEnd w:id="110"/>
+    <w:bookmarkStart w:id="111" w:name="性能"/>
     <w:p>
       <w:pPr>
         <w:pStyle w:val="Heading3"/>
@@ -10584,7 +10707,7 @@
       <w:pPr>
         <w:numPr>
           <w:ilvl w:val="0"/>
-          <w:numId w:val="1056"/>
+          <w:numId w:val="1057"/>
         </w:numPr>
         <w:pStyle w:val="Compact"/>
       </w:pPr>
@@ -10596,7 +10719,7 @@
       <w:pPr>
         <w:numPr>
           <w:ilvl w:val="0"/>
-          <w:numId w:val="1056"/>
+          <w:numId w:val="1057"/>
         </w:numPr>
         <w:pStyle w:val="Compact"/>
       </w:pPr>
@@ -10608,7 +10731,7 @@
       <w:pPr>
         <w:numPr>
           <w:ilvl w:val="0"/>
-          <w:numId w:val="1056"/>
+          <w:numId w:val="1057"/>
         </w:numPr>
         <w:pStyle w:val="Compact"/>
       </w:pPr>
@@ -10620,7 +10743,7 @@
       <w:pPr>
         <w:numPr>
           <w:ilvl w:val="0"/>
-          <w:numId w:val="1056"/>
+          <w:numId w:val="1057"/>
         </w:numPr>
         <w:pStyle w:val="Compact"/>
       </w:pPr>
@@ -10628,8 +10751,8 @@
         <w:t xml:space="preserve">大表校验：分片流式对比，避免内存爆炸</w:t>
       </w:r>
     </w:p>
-    <w:bookmarkEnd w:id="119"/>
-    <w:bookmarkStart w:id="120" w:name="可观测性"/>
+    <w:bookmarkEnd w:id="111"/>
+    <w:bookmarkStart w:id="112" w:name="可观测性"/>
     <w:p>
       <w:pPr>
         <w:pStyle w:val="Heading3"/>
@@ -10817,8 +10940,8 @@
         <w:t xml:space="preserve">告警覆盖任务失败、延迟过高、脏数据超限、校验差异、组件异常等，支持分级、抑制与多渠道通知。</w:t>
       </w:r>
     </w:p>
-    <w:bookmarkEnd w:id="120"/>
-    <w:bookmarkStart w:id="121" w:name="兼容性"/>
+    <w:bookmarkEnd w:id="112"/>
+    <w:bookmarkStart w:id="113" w:name="兼容性"/>
     <w:p>
       <w:pPr>
         <w:pStyle w:val="Heading3"/>
@@ -10831,7 +10954,7 @@
       <w:pPr>
         <w:numPr>
           <w:ilvl w:val="0"/>
-          <w:numId w:val="1057"/>
+          <w:numId w:val="1058"/>
         </w:numPr>
         <w:pStyle w:val="Compact"/>
       </w:pPr>
@@ -10843,7 +10966,7 @@
       <w:pPr>
         <w:numPr>
           <w:ilvl w:val="0"/>
-          <w:numId w:val="1057"/>
+          <w:numId w:val="1058"/>
         </w:numPr>
         <w:pStyle w:val="Compact"/>
       </w:pPr>
@@ -10873,7 +10996,7 @@
       <w:pPr>
         <w:numPr>
           <w:ilvl w:val="0"/>
-          <w:numId w:val="1057"/>
+          <w:numId w:val="1058"/>
         </w:numPr>
         <w:pStyle w:val="Compact"/>
       </w:pPr>
@@ -10885,7 +11008,7 @@
       <w:pPr>
         <w:numPr>
           <w:ilvl w:val="0"/>
-          <w:numId w:val="1057"/>
+          <w:numId w:val="1058"/>
         </w:numPr>
         <w:pStyle w:val="Compact"/>
       </w:pPr>
@@ -10900,9 +11023,9 @@
         </w:pict>
       </w:r>
     </w:p>
-    <w:bookmarkEnd w:id="121"/>
-    <w:bookmarkEnd w:id="122"/>
-    <w:bookmarkStart w:id="129" w:name="附录"/>
+    <w:bookmarkEnd w:id="113"/>
+    <w:bookmarkEnd w:id="114"/>
+    <w:bookmarkStart w:id="121" w:name="附录"/>
     <w:p>
       <w:pPr>
         <w:pStyle w:val="Heading2"/>
@@ -10911,7 +11034,7 @@
         <w:t xml:space="preserve">9. 附录</w:t>
       </w:r>
     </w:p>
-    <w:bookmarkStart w:id="123" w:name="关键设计决策"/>
+    <w:bookmarkStart w:id="115" w:name="关键设计决策"/>
     <w:p>
       <w:pPr>
         <w:pStyle w:val="Heading3"/>
@@ -10994,19 +11117,19 @@
               <w:jc w:val="left"/>
             </w:pPr>
             <w:r>
-              <w:t xml:space="preserve">四层 + 数据平面</w:t>
-            </w:r>
-          </w:p>
-        </w:tc>
-        <w:tc>
-          <w:tcPr/>
-          <w:p>
-            <w:pPr>
-              <w:pStyle w:val="Compact"/>
-              <w:jc w:val="left"/>
-            </w:pPr>
-            <w:r>
-              <w:t xml:space="preserve">接入、编排、执行、基础设施职责清晰，便于独立演进</w:t>
+              <w:t xml:space="preserve">接入 / 编排 / 组件三层 + 源-平台-目标</w:t>
+            </w:r>
+          </w:p>
+        </w:tc>
+        <w:tc>
+          <w:tcPr/>
+          <w:p>
+            <w:pPr>
+              <w:pStyle w:val="Compact"/>
+              <w:jc w:val="left"/>
+            </w:pPr>
+            <w:r>
+              <w:t xml:space="preserve">职责清晰，端到端数据路径直观</w:t>
             </w:r>
           </w:p>
         </w:tc>
@@ -11248,6 +11371,44 @@
               <w:jc w:val="left"/>
             </w:pPr>
             <w:r>
+              <w:t xml:space="preserve">AI 定位</w:t>
+            </w:r>
+          </w:p>
+        </w:tc>
+        <w:tc>
+          <w:tcPr/>
+          <w:p>
+            <w:pPr>
+              <w:pStyle w:val="Compact"/>
+              <w:jc w:val="left"/>
+            </w:pPr>
+            <w:r>
+              <w:t xml:space="preserve">辅助建议，不替代执行</w:t>
+            </w:r>
+          </w:p>
+        </w:tc>
+        <w:tc>
+          <w:tcPr/>
+          <w:p>
+            <w:pPr>
+              <w:pStyle w:val="Compact"/>
+              <w:jc w:val="left"/>
+            </w:pPr>
+            <w:r>
+              <w:t xml:space="preserve">降低异构映射与排障成本，保持主链路确定性</w:t>
+            </w:r>
+          </w:p>
+        </w:tc>
+      </w:tr>
+      <w:tr>
+        <w:tc>
+          <w:tcPr/>
+          <w:p>
+            <w:pPr>
+              <w:pStyle w:val="Compact"/>
+              <w:jc w:val="left"/>
+            </w:pPr>
+            <w:r>
               <w:t xml:space="preserve">目标端策略</w:t>
             </w:r>
           </w:p>
@@ -11260,26 +11421,26 @@
               <w:jc w:val="left"/>
             </w:pPr>
             <w:r>
-              <w:t xml:space="preserve">开放多数据库</w:t>
-            </w:r>
-          </w:p>
-        </w:tc>
-        <w:tc>
-          <w:tcPr/>
-          <w:p>
-            <w:pPr>
-              <w:pStyle w:val="Compact"/>
-              <w:jc w:val="left"/>
-            </w:pPr>
-            <w:r>
-              <w:t xml:space="preserve">通用迁移平台定位，不绑定单一厂商</w:t>
+              <w:t xml:space="preserve">开放多数据库 / 可投递消息队列</w:t>
+            </w:r>
+          </w:p>
+        </w:tc>
+        <w:tc>
+          <w:tcPr/>
+          <w:p>
+            <w:pPr>
+              <w:pStyle w:val="Compact"/>
+              <w:jc w:val="left"/>
+            </w:pPr>
+            <w:r>
+              <w:t xml:space="preserve">通用迁移与下游消费场景</w:t>
             </w:r>
           </w:p>
         </w:tc>
       </w:tr>
     </w:tbl>
-    <w:bookmarkEnd w:id="123"/>
-    <w:bookmarkStart w:id="124" w:name="演进路线"/>
+    <w:bookmarkEnd w:id="115"/>
+    <w:bookmarkStart w:id="116" w:name="演进路线"/>
     <w:p>
       <w:pPr>
         <w:pStyle w:val="Heading3"/>
@@ -11462,7 +11623,7 @@
               <w:jc w:val="left"/>
             </w:pPr>
             <w:r>
-              <w:t xml:space="preserve">HA、多租户配额、同源 Store 共享、无主键表增强</w:t>
+              <w:t xml:space="preserve">HA、多租户配额、AIEngine 映射建议与诊断</w:t>
             </w:r>
           </w:p>
         </w:tc>
@@ -11504,14 +11665,14 @@
               <w:jc w:val="left"/>
             </w:pPr>
             <w:r>
-              <w:t xml:space="preserve">多地域部署、反向增量、更丰富数据源与自动化切换</w:t>
+              <w:t xml:space="preserve">反向增量、更丰富数据源与自动化切换</w:t>
             </w:r>
           </w:p>
         </w:tc>
       </w:tr>
     </w:tbl>
-    <w:bookmarkEnd w:id="124"/>
-    <w:bookmarkStart w:id="125" w:name="图索引"/>
+    <w:bookmarkEnd w:id="116"/>
+    <w:bookmarkStart w:id="117" w:name="图索引"/>
     <w:p>
       <w:pPr>
         <w:pStyle w:val="Heading3"/>
@@ -11609,7 +11770,7 @@
               <w:jc w:val="left"/>
             </w:pPr>
             <w:r>
-              <w:t xml:space="preserve">系统逻辑架构图</w:t>
+              <w:t xml:space="preserve">系统逻辑架构图（源-平台-目标）</w:t>
             </w:r>
           </w:p>
         </w:tc>
@@ -11650,7 +11811,7 @@
               <w:jc w:val="left"/>
             </w:pPr>
             <w:r>
-              <w:t xml:space="preserve">模块组成图</w:t>
+              <w:t xml:space="preserve">三层模块组成图（含 AIEngine）</w:t>
             </w:r>
           </w:p>
         </w:tc>
@@ -11705,88 +11866,6 @@
               <w:jc w:val="left"/>
             </w:pPr>
             <w:r>
-              <w:t xml:space="preserve">图 3-4</w:t>
-            </w:r>
-          </w:p>
-        </w:tc>
-        <w:tc>
-          <w:tcPr/>
-          <w:p>
-            <w:pPr>
-              <w:pStyle w:val="Compact"/>
-              <w:jc w:val="left"/>
-            </w:pPr>
-            <w:r>
-              <w:rPr>
-                <w:rStyle w:val="VerbatimChar"/>
-              </w:rPr>
-              <w:t xml:space="preserve">images/fig3-4-single-node-deploy.png</w:t>
-            </w:r>
-          </w:p>
-        </w:tc>
-        <w:tc>
-          <w:tcPr/>
-          <w:p>
-            <w:pPr>
-              <w:pStyle w:val="Compact"/>
-              <w:jc w:val="left"/>
-            </w:pPr>
-            <w:r>
-              <w:t xml:space="preserve">单机部署架构图</w:t>
-            </w:r>
-          </w:p>
-        </w:tc>
-      </w:tr>
-      <w:tr>
-        <w:tc>
-          <w:tcPr/>
-          <w:p>
-            <w:pPr>
-              <w:pStyle w:val="Compact"/>
-              <w:jc w:val="left"/>
-            </w:pPr>
-            <w:r>
-              <w:t xml:space="preserve">图 3-5</w:t>
-            </w:r>
-          </w:p>
-        </w:tc>
-        <w:tc>
-          <w:tcPr/>
-          <w:p>
-            <w:pPr>
-              <w:pStyle w:val="Compact"/>
-              <w:jc w:val="left"/>
-            </w:pPr>
-            <w:r>
-              <w:rPr>
-                <w:rStyle w:val="VerbatimChar"/>
-              </w:rPr>
-              <w:t xml:space="preserve">images/fig3-5-multi-node-ha.png</w:t>
-            </w:r>
-          </w:p>
-        </w:tc>
-        <w:tc>
-          <w:tcPr/>
-          <w:p>
-            <w:pPr>
-              <w:pStyle w:val="Compact"/>
-              <w:jc w:val="left"/>
-            </w:pPr>
-            <w:r>
-              <w:t xml:space="preserve">多节点 HA 部署架构图</w:t>
-            </w:r>
-          </w:p>
-        </w:tc>
-      </w:tr>
-      <w:tr>
-        <w:tc>
-          <w:tcPr/>
-          <w:p>
-            <w:pPr>
-              <w:pStyle w:val="Compact"/>
-              <w:jc w:val="left"/>
-            </w:pPr>
-            <w:r>
               <w:t xml:space="preserve">图 5-1</w:t>
             </w:r>
           </w:p>
@@ -11943,8 +12022,8 @@
         </w:tc>
       </w:tr>
     </w:tbl>
-    <w:bookmarkEnd w:id="125"/>
-    <w:bookmarkStart w:id="128" w:name="文档索引"/>
+    <w:bookmarkEnd w:id="117"/>
+    <w:bookmarkStart w:id="120" w:name="文档索引"/>
     <w:p>
       <w:pPr>
         <w:pStyle w:val="Heading3"/>
@@ -12013,7 +12092,7 @@
               <w:pStyle w:val="Compact"/>
               <w:jc w:val="left"/>
             </w:pPr>
-            <w:hyperlink r:id="rId126">
+            <w:hyperlink r:id="rId118">
               <w:r>
                 <w:rPr>
                   <w:rStyle w:val="Hyperlink"/>
@@ -12044,7 +12123,7 @@
               <w:pStyle w:val="Compact"/>
               <w:jc w:val="left"/>
             </w:pPr>
-            <w:hyperlink r:id="rId127">
+            <w:hyperlink r:id="rId119">
               <w:r>
                 <w:rPr>
                   <w:rStyle w:val="Hyperlink"/>
@@ -12110,12 +12189,12 @@
           <w:iCs/>
           <w:i/>
         </w:rPr>
-        <w:t xml:space="preserve">文档结束 — 迁移平台软件设计说明书 v3.1（评审稿）</w:t>
-      </w:r>
-    </w:p>
-    <w:bookmarkEnd w:id="128"/>
-    <w:bookmarkEnd w:id="129"/>
-    <w:bookmarkEnd w:id="130"/>
+        <w:t xml:space="preserve">文档结束 — 迁移平台软件设计说明书 v3.2（评审稿）</w:t>
+      </w:r>
+    </w:p>
+    <w:bookmarkEnd w:id="120"/>
+    <w:bookmarkEnd w:id="121"/>
+    <w:bookmarkEnd w:id="122"/>
     <w:sectPr/>
   </w:body>
 </w:document>
@@ -12758,6 +12837,9 @@
     <w:abstractNumId w:val="991"/>
   </w:num>
   <w:num w:numId="1050">
+    <w:abstractNumId w:val="991"/>
+  </w:num>
+  <w:num w:numId="1051">
     <w:abstractNumId w:val="99411"/>
     <w:lvlOverride w:ilvl="0">
       <w:startOverride w:val="1"/>
@@ -12787,7 +12869,7 @@
       <w:startOverride w:val="1"/>
     </w:lvlOverride>
   </w:num>
-  <w:num w:numId="1051">
+  <w:num w:numId="1052">
     <w:abstractNumId w:val="99413"/>
     <w:lvlOverride w:ilvl="0">
       <w:startOverride w:val="3"/>
@@ -12817,7 +12899,7 @@
       <w:startOverride w:val="3"/>
     </w:lvlOverride>
   </w:num>
-  <w:num w:numId="1052">
+  <w:num w:numId="1053">
     <w:abstractNumId w:val="99416"/>
     <w:lvlOverride w:ilvl="0">
       <w:startOverride w:val="6"/>
@@ -12847,7 +12929,7 @@
       <w:startOverride w:val="6"/>
     </w:lvlOverride>
   </w:num>
-  <w:num w:numId="1053">
+  <w:num w:numId="1054">
     <w:abstractNumId w:val="99411"/>
     <w:lvlOverride w:ilvl="0">
       <w:startOverride w:val="1"/>
@@ -12877,9 +12959,6 @@
       <w:startOverride w:val="1"/>
     </w:lvlOverride>
   </w:num>
-  <w:num w:numId="1054">
-    <w:abstractNumId w:val="991"/>
-  </w:num>
   <w:num w:numId="1055">
     <w:abstractNumId w:val="991"/>
   </w:num>
@@ -12887,6 +12966,9 @@
     <w:abstractNumId w:val="991"/>
   </w:num>
   <w:num w:numId="1057">
+    <w:abstractNumId w:val="991"/>
+  </w:num>
+  <w:num w:numId="1058">
     <w:abstractNumId w:val="991"/>
   </w:num>
 </w:numbering>

</xml_diff>